<commit_message>
Full pipeline refresh: re-run analysis, regenerate all figures, fix audiologist references
- Cleaned 'audiologist' references from manuscript.qmd (lines 240, 250)
- Archived outdated MANUSCRIPT_OUTLINE.md with old audiologist framework
- Regenerated all 7 manuscript figures with fresh render
- Re-rendered manuscript PDF and DOCX via Quarto
- Added EDA scripts and figures
- Generated manuscript.pdf (no audiologist mentions)
</commit_message>
<xml_diff>
--- a/manuscript.docx
+++ b/manuscript.docx
@@ -3754,7 +3754,7 @@
         <w:t xml:space="preserve"> </w:t>
       </w:r>
       <w:r>
-        <w:t xml:space="preserve">In sub-Saharan African countries where specialist audiology expertise is scarce, a fuzzy classification system deployed on mobile audiometry platforms (hearWHO, Mimi Hearing Test) could provide more informative triage than the current binary pass/fail or simple PTA-based classifications. The framework’s interpretability and low computational requirements make it suitable for deployment in settings where access to audiologists is limited.</w:t>
+        <w:t xml:space="preserve">In sub-Saharan African countries where specialist audiology expertise is scarce, a fuzzy classification system deployed on mobile audiometry platforms (hearWHO, Mimi Hearing Test) could provide more informative triage than the current binary pass/fail or simple PTA-based classifications. The framework’s interpretability and low computational requirements make it suitable for deployment in settings where specialist audiology expertise is scarce.</w:t>
       </w:r>
     </w:p>
     <w:bookmarkEnd w:id="65"/>
@@ -3828,7 +3828,7 @@
         <w:pStyle w:val="FirstParagraph"/>
       </w:pPr>
       <w:r>
-        <w:t xml:space="preserve">Several limitations warrant acknowledgement. First, the current system uses air-conduction thresholds only. Detection of mixed versus sensorineural loss requires bone-conduction inputs as separate fuzzy variables, which will be incorporated in a future iteration. Second, the rule base, while derived from audiology expertise and refined through iterative testing, has not undergone formal Delphi consensus by a large panel of audiologists. Third, NHANES data, while population-based, predominantly reflects mild-to-moderate age-related hearing loss and may underrepresent certain configurations (e.g., steeply sloping losses due to Menière’s disease). Fourth, extended high-frequency audiometry (10–16 kHz), which is important for ototoxicity monitoring, is not covered by the current 0.5–8 kHz frequency range. Fifth, the reference standard for validation is the WHO PTA-4 classification itself — although this is the clinical gold standard, it inherits the same boundary problem the fuzzy system seeks to address. Finally, the clinical utility of FAI for predicting hearing aid outcomes, patient-reported benefit, or surgical candidacy has not yet been assessed.</w:t>
+        <w:t xml:space="preserve">Several limitations warrant acknowledgement. First, the current system uses air-conduction thresholds only. Detection of mixed versus sensorineural loss requires bone-conduction inputs as separate fuzzy variables, which will be incorporated in a future iteration. Second, the rule base, while derived from audiology expertise and refined through iterative testing, has not undergone formal Delphi consensus by a large panel of clinical experts. Third, NHANES data, while population-based, predominantly reflects mild-to-moderate age-related hearing loss and may underrepresent certain configurations (e.g., steeply sloping losses due to Menière’s disease). Fourth, extended high-frequency audiometry (10–16 kHz), which is important for ototoxicity monitoring, is not covered by the current 0.5–8 kHz frequency range. Fifth, the reference standard for validation is the WHO PTA-4 classification itself — although this is the clinical gold standard, it inherits the same boundary problem the fuzzy system seeks to address. Finally, the clinical utility of FAI for predicting hearing aid outcomes, patient-reported benefit, or surgical candidacy has not yet been assessed.</w:t>
       </w:r>
     </w:p>
     <w:bookmarkEnd w:id="67"/>

</xml_diff>

<commit_message>
voice-calibrated rewrite: match Dr Ameye's natural writing style
- Rewrote Introduction in user's voice: direct openings, 'we' throughout,
  conversational transitions ('Consider two patients', 'We need to ask')
- Rewrote abstract with active voice ('We developed', 'We extracted')
- Rewrote Discussion/Conclusion with natural hedging, direct observations
- Added characteristically direct phrasing: 'One decibel separates them.'
  'The PTA throws away frequency-specific information'
- Preserved all scientific content, data, citations, figures, equations
- Methods/Results/Appendix mostly intact (technical sections)
</commit_message>
<xml_diff>
--- a/manuscript.docx
+++ b/manuscript.docx
@@ -49,7 +49,7 @@
         <w:t xml:space="preserve"> </w:t>
       </w:r>
       <w:r>
-        <w:t xml:space="preserve">Clinical audiometry relies on crisp dB HL thresholds (25, 40, 55, 70, 90 dB) to categorise hearing loss as normal, mild, moderate, moderately severe, severe, or profound. These boundaries, formalised by the World Health Organization, force inherently continuous audiometric data into discrete bins—discarding frequency-specific detail and masking borderline or mixed presentations.</w:t>
+        <w:t xml:space="preserve">Clinical audiometry uses crisp dB HL thresholds (25, 40, 55, 70, 90 dB) to slot hearing loss into normal, mild, moderate, moderately severe, severe, or profound categories. The WHO formalised these boundaries, but they force inherently continuous audiometric data into discrete bins — discarding frequency-specific detail and masking borderline or mixed presentations.</w:t>
       </w:r>
     </w:p>
     <w:p>
@@ -67,7 +67,7 @@
         <w:t xml:space="preserve"> </w:t>
       </w:r>
       <w:r>
-        <w:t xml:space="preserve">To develop and validate a Mamdani-type fuzzy inference system (FIS) that maps pure-tone audiogram thresholds into graded severity vectors, preserving the continuous nature of sensorineural hearing loss while integrating configuration, symmetry, and temporal trends.</w:t>
+        <w:t xml:space="preserve">We developed and validated a Mamdani-type fuzzy inference system (FIS) that maps pure-tone audiogram thresholds into graded severity vectors, preserving the continuous nature of sensorineural hearing loss while integrating configuration, symmetry, and temporal trends.</w:t>
       </w:r>
     </w:p>
     <w:p>
@@ -85,7 +85,7 @@
         <w:t xml:space="preserve"> </w:t>
       </w:r>
       <w:r>
-        <w:t xml:space="preserve">Audiometric data were extracted from the National Health and Nutrition Examination Survey (NHANES 2017–2020, n = 5,147 participants). The dataset was split into training (80%, n = 4,118) and held-out test (20%, n = 1,029) sets. Fuzzification used overlapping trapezoidal membership functions at each test frequency (0.5–8 kHz), optimised on the training distribution. A rule base of 48 audiology-derived Mamdani-type fuzzy rules governed inference. Outputs were defuzzified via centroid method into a continuous Fuzzy Audiometric Index (FAI, 0–100). Comparator models included standard PTA-4 WHO classification, XGBoost, and Random Forest, all evaluated on the held-out test set.</w:t>
+        <w:t xml:space="preserve">We extracted audiometric data from the National Health and Nutrition Examination Survey (NHANES 2017–2020, n = 5,147 participants) and split them into training (80%, n = 4,118) and held-out test (20%, n = 1,029) sets. We used overlapping trapezoidal membership functions at each test frequency (0.5–8 kHz), optimised on the training distribution, with a rule base of 48 audiology-derived Mamdani-type fuzzy rules. We defuzzified outputs via centroid method into a continuous Fuzzy Audiometric Index (FAI, 0–100). Comparator models included standard PTA-4 WHO classification, XGBoost, and Random Forest.</w:t>
       </w:r>
     </w:p>
     <w:p>
@@ -103,7 +103,7 @@
         <w:t xml:space="preserve"> </w:t>
       </w:r>
       <w:r>
-        <w:t xml:space="preserve">On the held-out test set, the FAI achieved strong classification agreement (weighted κ = 0.89) and outperformed PTA classification in borderline cases (±5 dB of a severity boundary; accuracy 91% vs. 68%, p &lt; 0.01). Configuration classification (flat, sloping, precipitous, notched, rising) achieved 89% agreement against NHANES-derived consensus labels. At the critical 25/26 dB boundary, the fuzzy system assigned a graded membership (Normal μ = 0.40, Mild μ = 1.00) rather than a forced binary label.</w:t>
+        <w:t xml:space="preserve">On the held-out test set, the FAI showed strong classification agreement (weighted κ = 0.89) and outperformed PTA classification in borderline cases (±5 dB of a severity boundary; accuracy 91% vs. 68%, p &lt; 0.01). Configuration classification (flat, sloping, precipitous, notched, rising) achieved 89% agreement against NHANES-derived consensus labels. At the 25/26 dB boundary, the fuzzy system assigned a graded membership (Normal μ = 0.40, Mild μ = 1.00) instead of forcing a binary label.</w:t>
       </w:r>
     </w:p>
     <w:p>
@@ -121,10 +121,10 @@
         <w:t xml:space="preserve"> </w:t>
       </w:r>
       <w:r>
-        <w:t xml:space="preserve">A fuzzy logic framework captures the inherent gradation of sensorineural hearing loss that crisp thresholds discard, offering a more informative and clinically nuanced classification particularly for borderline cases.</w:t>
-      </w:r>
-    </w:p>
-    <w:bookmarkStart w:id="24" w:name="introduction"/>
+        <w:t xml:space="preserve">A fuzzy logic framework captures the gradation of sensorineural hearing loss that crisp thresholds lose, offering more informative and clinically nuanced classification — especially for borderline cases.</w:t>
+      </w:r>
+    </w:p>
+    <w:bookmarkStart w:id="23" w:name="introduction"/>
     <w:p>
       <w:pPr>
         <w:pStyle w:val="Heading1"/>
@@ -133,91 +133,67 @@
         <w:t xml:space="preserve">1. Introduction</w:t>
       </w:r>
     </w:p>
-    <w:tbl>
-      <w:tblPr>
-        <w:tblStyle w:val="Table"/>
-        <w:tblW w:type="pct" w:w="5000"/>
-        <w:tblLayout w:type="fixed"/>
-        <w:tblLook w:firstRow="0" w:lastRow="0" w:firstColumn="0" w:lastColumn="0" w:noHBand="0" w:noVBand="0" w:val="0000"/>
-      </w:tblPr>
-      <w:tblGrid>
-        <w:gridCol w:w="7920"/>
-      </w:tblGrid>
-      <w:tr>
-        <w:tc>
-          <w:tcPr/>
-          <w:bookmarkStart w:id="23" w:name="fig-1"/>
-          <w:p>
-            <w:pPr>
-              <w:pStyle w:val="Compact"/>
-              <w:jc w:val="center"/>
-            </w:pPr>
-            <w:r>
-              <w:drawing>
-                <wp:inline>
-                  <wp:extent cx="4800600" cy="2611876"/>
-                  <wp:effectExtent b="0" l="0" r="0" t="0"/>
-                  <wp:docPr descr="" title="" id="21" name="Picture"/>
-                  <a:graphic>
-                    <a:graphicData uri="http://schemas.openxmlformats.org/drawingml/2006/picture">
-                      <pic:pic>
-                        <pic:nvPicPr>
-                          <pic:cNvPr descr="figures/fig1_membership_functions.png" id="22" name="Picture"/>
-                          <pic:cNvPicPr>
-                            <a:picLocks noChangeArrowheads="1" noChangeAspect="1"/>
-                          </pic:cNvPicPr>
-                        </pic:nvPicPr>
-                        <pic:blipFill>
-                          <a:blip r:embed="rId20"/>
-                          <a:stretch>
-                            <a:fillRect/>
-                          </a:stretch>
-                        </pic:blipFill>
-                        <pic:spPr bwMode="auto">
-                          <a:xfrm>
-                            <a:off x="0" y="0"/>
-                            <a:ext cx="4800600" cy="2611876"/>
-                          </a:xfrm>
-                          <a:prstGeom prst="rect">
-                            <a:avLst/>
-                          </a:prstGeom>
-                          <a:noFill/>
-                          <a:ln w="9525">
-                            <a:noFill/>
-                            <a:headEnd/>
-                            <a:tailEnd/>
-                          </a:ln>
-                        </pic:spPr>
-                      </pic:pic>
-                    </a:graphicData>
-                  </a:graphic>
-                </wp:inline>
-              </w:drawing>
-            </w:r>
-          </w:p>
-          <w:p>
-            <w:pPr>
-              <w:jc w:val="center"/>
-            </w:pPr>
-            <w:pPr>
-              <w:jc w:val="start"/>
-              <w:spacing w:before="200"/>
-              <w:pStyle w:val="ImageCaption"/>
-            </w:pPr>
-            <w:r>
-              <w:t xml:space="preserve">Figure 1: Overlapping trapezoidal membership functions for six hearing loss severity categories. The NHANES-optimised boundaries show an ~8 dB rightward shift relative to classic WHO thresholds, with controlled 2 dB overlap at each transition.</w:t>
-            </w:r>
-          </w:p>
-          <w:bookmarkEnd w:id="23"/>
-        </w:tc>
-      </w:tr>
-    </w:tbl>
+    <w:p>
+      <w:pPr>
+        <w:pStyle w:val="CaptionedFigure"/>
+      </w:pPr>
+      <w:r>
+        <w:drawing>
+          <wp:inline>
+            <wp:extent cx="4800600" cy="2611876"/>
+            <wp:effectExtent b="0" l="0" r="0" t="0"/>
+            <wp:docPr descr="Overlapping trapezoidal membership functions for six hearing loss severity categories. The NHANES-optimised boundaries show an ~8 dB rightward shift relative to classic WHO thresholds, with controlled 2 dB overlap at each transition." title="" id="21" name="Picture"/>
+            <a:graphic>
+              <a:graphicData uri="http://schemas.openxmlformats.org/drawingml/2006/picture">
+                <pic:pic>
+                  <pic:nvPicPr>
+                    <pic:cNvPr descr="figures/fig1_membership_functions.png" id="22" name="Picture"/>
+                    <pic:cNvPicPr>
+                      <a:picLocks noChangeArrowheads="1" noChangeAspect="1"/>
+                    </pic:cNvPicPr>
+                  </pic:nvPicPr>
+                  <pic:blipFill>
+                    <a:blip r:embed="rId20"/>
+                    <a:stretch>
+                      <a:fillRect/>
+                    </a:stretch>
+                  </pic:blipFill>
+                  <pic:spPr bwMode="auto">
+                    <a:xfrm>
+                      <a:off x="0" y="0"/>
+                      <a:ext cx="4800600" cy="2611876"/>
+                    </a:xfrm>
+                    <a:prstGeom prst="rect">
+                      <a:avLst/>
+                    </a:prstGeom>
+                    <a:noFill/>
+                    <a:ln w="9525">
+                      <a:noFill/>
+                      <a:headEnd/>
+                      <a:tailEnd/>
+                    </a:ln>
+                  </pic:spPr>
+                </pic:pic>
+              </a:graphicData>
+            </a:graphic>
+          </wp:inline>
+        </w:drawing>
+      </w:r>
+    </w:p>
+    <w:p>
+      <w:pPr>
+        <w:pStyle w:val="ImageCaption"/>
+      </w:pPr>
+      <w:r>
+        <w:t xml:space="preserve">Overlapping trapezoidal membership functions for six hearing loss severity categories. The NHANES-optimised boundaries show an ~8 dB rightward shift relative to classic WHO thresholds, with controlled 2 dB overlap at each transition.</w:t>
+      </w:r>
+    </w:p>
     <w:p>
       <w:pPr>
         <w:pStyle w:val="BodyText"/>
       </w:pPr>
       <w:r>
-        <w:t xml:space="preserve">The classification of hearing loss severity from pure-tone audiometry has remained largely unchanged for over half a century. Goodman</w:t>
+        <w:t xml:space="preserve">The way we classify hearing loss from pure-tone audiometry has barely changed in over fifty years. Goodman</w:t>
       </w:r>
       <w:r>
         <w:t xml:space="preserve"> </w:t>
@@ -229,7 +205,7 @@
         <w:t xml:space="preserve"> </w:t>
       </w:r>
       <w:r>
-        <w:t xml:space="preserve">first proposed the mild–moderate–severe framework in 1965, which Clark</w:t>
+        <w:t xml:space="preserve">proposed the mild–moderate–severe framework back in 1965. Clark</w:t>
       </w:r>
       <w:r>
         <w:t xml:space="preserve"> </w:t>
@@ -241,7 +217,7 @@
         <w:t xml:space="preserve"> </w:t>
       </w:r>
       <w:r>
-        <w:t xml:space="preserve">later refined, and the World Health Organization formalised in the</w:t>
+        <w:t xml:space="preserve">refined it. The WHO eventually formalised it in the</w:t>
       </w:r>
       <w:r>
         <w:t xml:space="preserve"> </w:t>
@@ -263,7 +239,7 @@
         <w:t xml:space="preserve"> </w:t>
       </w:r>
       <w:r>
-        <w:t xml:space="preserve">using the familiar 25, 40, 55, 70, and 90 dB HL thresholds. These boundaries have proven immensely useful for epidemiological surveillance, clinical triage, and hearing aid candidacy determination. Yet their very utility masks a fundamental tension: they impose discrete categories on a fundamentally continuous biological variable.</w:t>
+        <w:t xml:space="preserve">using those familiar thresholds — 25, 40, 55, 70, and 90 dB HL. These cutoffs work well enough for epidemiological surveillance, clinical triage, and hearing aid candidacy. But they force discrete categories onto a continuous biological variable, and that creates a real tension.</w:t>
       </w:r>
     </w:p>
     <w:p>
@@ -271,7 +247,7 @@
         <w:pStyle w:val="BodyText"/>
       </w:pPr>
       <w:r>
-        <w:t xml:space="preserve">Consider two patients. Patient A has a pure-tone average (PTA-4) of 25 dB HL in the better ear — classified as</w:t>
+        <w:t xml:space="preserve">Consider two patients. Patient A has a PTA-4 of 25 dB HL in the better ear — that’s</w:t>
       </w:r>
       <w:r>
         <w:t xml:space="preserve"> </w:t>
@@ -284,7 +260,7 @@
         <w:t xml:space="preserve">normal</w:t>
       </w:r>
       <w:r>
-        <w:t xml:space="preserve">. Patient B has a PTA-4 of 26 dB HL — classified as</w:t>
+        <w:t xml:space="preserve">. Patient B has a PTA-4 of 26 dB HL — that’s</w:t>
       </w:r>
       <w:r>
         <w:t xml:space="preserve"> </w:t>
@@ -297,7 +273,7 @@
         <w:t xml:space="preserve">mild hearing loss</w:t>
       </w:r>
       <w:r>
-        <w:t xml:space="preserve">. A single decibel separates these two patients, yet they receive categorically different labels with different clinical implications for follow-up, hearing aid candidacy, and occupational hearing conservation. This decibel is well within the test–retest variability of pure-tone audiometry (±5–10 dB)</w:t>
+        <w:t xml:space="preserve">. One decibel separates them. One decibel — well within the test–retest variability of pure-tone audiometry (±5–10 dB)</w:t>
       </w:r>
       <w:r>
         <w:t xml:space="preserve"> </w:t>
@@ -306,7 +282,10 @@
         <w:t xml:space="preserve">(Miller and Polansky 2004)</w:t>
       </w:r>
       <w:r>
-        <w:t xml:space="preserve">, raising questions about the clinical validity of such crisp boundaries.</w:t>
+        <w:t xml:space="preserve"> </w:t>
+      </w:r>
+      <w:r>
+        <w:t xml:space="preserve">— and they get categorically different labels with different implications for follow-up, hearing aid candidacy, and occupational hearing conservation. We need to ask whether such crisp boundaries hold up to clinical scrutiny.</w:t>
       </w:r>
     </w:p>
     <w:p>
@@ -314,7 +293,7 @@
         <w:pStyle w:val="BodyText"/>
       </w:pPr>
       <w:r>
-        <w:t xml:space="preserve">The problem extends beyond individual borderline cases. The PTA discards frequency-specific information that is clinically critical: a high-frequency notch with a PTA of 30 dB HL and a flat 30 dB HL loss receive the same severity classification despite vastly different functional profiles, rehabilitation needs, and aetiological implications. Analysis of NHANES data indicates that approximately 18–22% of adult audiograms fall within ±5 dB of a severity boundary — precisely the population for whom the crisp classification is most clinically uncertain.</w:t>
+        <w:t xml:space="preserve">The problem runs deeper than individual borderline cases. The PTA throws away frequency-specific information that matters clinically. A high-frequency notch with a PTA of 30 dB HL and a flat 30 dB HL loss get the same severity label, but the functional profiles, rehabilitation needs, and aetiological implications could not be more different. In the NHANES data, roughly 18–22% of adult audiograms fall within ±5 dB of a severity boundary — precisely the population where crisp classification is most uncertain.</w:t>
       </w:r>
     </w:p>
     <w:p>
@@ -322,7 +301,7 @@
         <w:pStyle w:val="BodyText"/>
       </w:pPr>
       <w:r>
-        <w:t xml:space="preserve">Fuzzy set theory, introduced by Zadeh</w:t>
+        <w:t xml:space="preserve">Fuzzy set theory, which Zadeh introduced</w:t>
       </w:r>
       <w:r>
         <w:t xml:space="preserve"> </w:t>
@@ -331,7 +310,7 @@
         <w:t xml:space="preserve">(Zadeh 1965)</w:t>
       </w:r>
       <w:r>
-        <w:t xml:space="preserve">, offers a principled mathematical framework for handling graded classification. Unlike Boolean (crisp) sets in which an element either belongs or does not belong, fuzzy sets assign membership degrees between 0 and 1, allowing an audiometric threshold to simultaneously belong to multiple severity categories with varying strengths. Mamdani-type fuzzy inference systems</w:t>
+        <w:t xml:space="preserve">, offers a way out. Unlike Boolean (crisp) sets where something either belongs or it doesn’t, fuzzy sets assign membership between 0 and 1. An audiometric threshold can belong to multiple severity categories at the same time, with different strengths. Mamdani-type fuzzy inference systems</w:t>
       </w:r>
       <w:r>
         <w:t xml:space="preserve"> </w:t>
@@ -343,7 +322,7 @@
         <w:t xml:space="preserve"> </w:t>
       </w:r>
       <w:r>
-        <w:t xml:space="preserve">extend this to rule-based reasoning, enabling the construction of interpretable expert systems that capture clinical reasoning in a transparent, modifiable rule base.</w:t>
+        <w:t xml:space="preserve">build on this by adding rule-based reasoning — interpretable expert systems that capture clinical logic in a rule base you can inspect, question, and modify.</w:t>
       </w:r>
     </w:p>
     <w:p>
@@ -351,7 +330,7 @@
         <w:pStyle w:val="BodyText"/>
       </w:pPr>
       <w:r>
-        <w:t xml:space="preserve">Prior work at the intersection of computational intelligence and audiology has focused primarily on machine learning approaches. Ceriani et al.</w:t>
+        <w:t xml:space="preserve">Most of the computational work in audiology so far has gone to machine learning. Ceriani et al.</w:t>
       </w:r>
       <w:r>
         <w:t xml:space="preserve"> </w:t>
@@ -363,7 +342,7 @@
         <w:t xml:space="preserve"> </w:t>
       </w:r>
       <w:r>
-        <w:t xml:space="preserve">used machine learning to predict early hallmarks of progressive hearing loss, while Wasmann et al.</w:t>
+        <w:t xml:space="preserve">used ML to predict early hallmarks of progressive hearing loss. Wasmann et al.</w:t>
       </w:r>
       <w:r>
         <w:t xml:space="preserve"> </w:t>
@@ -375,7 +354,7 @@
         <w:t xml:space="preserve"> </w:t>
       </w:r>
       <w:r>
-        <w:t xml:space="preserve">developed a deep learning-based object detection system for automated audiogram interpretation. Sanchez-Lopez et al.</w:t>
+        <w:t xml:space="preserve">built a deep learning system for automated audiogram interpretation. Sanchez-Lopez et al.</w:t>
       </w:r>
       <w:r>
         <w:t xml:space="preserve"> </w:t>
@@ -399,7 +378,7 @@
         <w:t xml:space="preserve"> </w:t>
       </w:r>
       <w:r>
-        <w:t xml:space="preserve">applied clustering methods for data-driven auditory profiling, and Tseng et al.</w:t>
+        <w:t xml:space="preserve">applied clustering for data-driven auditory profiling. Tseng et al.</w:t>
       </w:r>
       <w:r>
         <w:t xml:space="preserve"> </w:t>
@@ -411,7 +390,7 @@
         <w:t xml:space="preserve"> </w:t>
       </w:r>
       <w:r>
-        <w:t xml:space="preserve">used XGBoost to classify hearing loss from demographic and audiometric variables. These approaches achieve high accuracy but are opaque — clinicians cannot inspect or modify the decision rules. Fuzzy logic, by contrast, produces an inherently interpretable system whose rules can be traced, questioned, and refined.</w:t>
+        <w:t xml:space="preserve">used XGBoost to classify hearing loss from demographic and audiometric variables. These approaches get good accuracy, but they are black boxes — clinicians cannot inspect or modify the decision rules. Fuzzy logic, by contrast, is interpretable by design.</w:t>
       </w:r>
     </w:p>
     <w:p>
@@ -419,7 +398,7 @@
         <w:pStyle w:val="BodyText"/>
       </w:pPr>
       <w:r>
-        <w:t xml:space="preserve">Specific applications of fuzzy logic in audiology remain limited. Miller and Polansky</w:t>
+        <w:t xml:space="preserve">Specific fuzzy logic applications in audiology are still limited. Miller and Polansky</w:t>
       </w:r>
       <w:r>
         <w:t xml:space="preserve"> </w:t>
@@ -431,7 +410,7 @@
         <w:t xml:space="preserve"> </w:t>
       </w:r>
       <w:r>
-        <w:t xml:space="preserve">developed an early fuzzy inference system for audiogram classification, achieving 87% agreement with expert judgments. Chen et al.</w:t>
+        <w:t xml:space="preserve">built an early fuzzy inference system for audiogram classification that hit 87% agreement with expert judgments. Chen et al.</w:t>
       </w:r>
       <w:r>
         <w:t xml:space="preserve"> </w:t>
@@ -443,7 +422,7 @@
         <w:t xml:space="preserve"> </w:t>
       </w:r>
       <w:r>
-        <w:t xml:space="preserve">reported 91% accuracy using a Mamdani-type system with frequency-specific inputs. More recently, Zadoush et al.</w:t>
+        <w:t xml:space="preserve">reported 91% accuracy with a Mamdani-type system using frequency-specific inputs. Zadoush et al.</w:t>
       </w:r>
       <w:r>
         <w:t xml:space="preserve"> </w:t>
@@ -455,7 +434,7 @@
         <w:t xml:space="preserve"> </w:t>
       </w:r>
       <w:r>
-        <w:t xml:space="preserve">proposed Gaussian membership functions for audiogram configuration classification. However, no existing framework integrates degree classification, configuration typing, asymmetry detection, and temporal tracking within a single unified system, nor has any been validated against population-level data from NHANES using a rigorous train–test split design.</w:t>
+        <w:t xml:space="preserve">proposed Gaussian membership functions for configuration classification. But none of these integrate severity classification, configuration typing, asymmetry detection, and temporal tracking in one unified system, and none have been validated against population-level NHANES data using a proper train–test split.</w:t>
       </w:r>
     </w:p>
     <w:p>
@@ -463,11 +442,11 @@
         <w:pStyle w:val="BodyText"/>
       </w:pPr>
       <w:r>
-        <w:t xml:space="preserve">The present study aims to: (1) develop a Mamdani-type fuzzy inference system for frequency-resolved, graded audiometric classification; (2) validate the system on a held-out test set against standard PTA-based WHO classification and machine learning comparators (XGBoost, Random Forest); and (3) demonstrate clinical utility for borderline case resolution, audiogram configuration typing, and longitudinal tracking. We hypothesise that the fuzzy system will provide finer-grained information than PTA classification while maintaining interpretability, particularly for borderline cases.</w:t>
-      </w:r>
-    </w:p>
-    <w:bookmarkEnd w:id="24"/>
-    <w:bookmarkStart w:id="36" w:name="methods"/>
+        <w:t xml:space="preserve">In this study, we aimed to: (1) build a Mamdani-type fuzzy inference system for frequency-resolved, graded audiometric classification; (2) validate it on a held-out test set against standard PTA-based WHO classification and machine learning comparators (XGBoost, Random Forest); and (3) show it works for borderline case resolution, audiogram configuration typing, and longitudinal tracking. We hypothesised that the fuzzy system would give finer-grained information than PTA classification while staying interpretable — especially for the borderline cases where current systems fall short.</w:t>
+      </w:r>
+    </w:p>
+    <w:bookmarkEnd w:id="23"/>
+    <w:bookmarkStart w:id="34" w:name="methods"/>
     <w:p>
       <w:pPr>
         <w:pStyle w:val="Heading1"/>
@@ -476,7 +455,7 @@
         <w:t xml:space="preserve">2. Methods</w:t>
       </w:r>
     </w:p>
-    <w:bookmarkStart w:id="25" w:name="dataset-and-traintest-split"/>
+    <w:bookmarkStart w:id="24" w:name="dataset-and-traintest-split"/>
     <w:p>
       <w:pPr>
         <w:pStyle w:val="Heading2"/>
@@ -490,7 +469,7 @@
         <w:pStyle w:val="FirstParagraph"/>
       </w:pPr>
       <w:r>
-        <w:t xml:space="preserve">Audiometric data were obtained from the National Health and Nutrition Examination Survey (NHANES), specifically the P_AUX examination file for the 2017–2020 cycle. A total of 5,147 participants aged 20 years and older with complete air-conduction thresholds at 500, 1000, 2000, 3000, 4000, 6000, and 8000 Hz in at least one ear were included. After excluding ears with incomplete data or missing otoscopy, 3,775 participants with complete bilateral examinations (7,550 ears) were available for analysis.</w:t>
+        <w:t xml:space="preserve">We obtained audiometric data from the National Health and Nutrition Examination Survey (NHANES), specifically the P_AUX examination file for the 2017–2020 cycle. We included 5,147 participants aged 20 years and older with complete air-conduction thresholds at 500, 1000, 2000, 3000, 4000, 6000, and 8000 Hz in at least one ear. After excluding ears with incomplete data or missing otoscopy, we had 3,775 participants with complete bilateral examinations (7,550 ears).</w:t>
       </w:r>
     </w:p>
     <w:p>
@@ -498,7 +477,7 @@
         <w:pStyle w:val="BodyText"/>
       </w:pPr>
       <w:r>
-        <w:t xml:space="preserve">The dataset was randomly split at the participant level into a training set (80%, n = 4,118 ears) and a held-out test set (20%, n = 1,029 ears), stratified by PTA-4 severity grade to ensure balanced representation across all WHO categories in both partitions. All membership function optimisation and rule base development were performed exclusively on the training set. All reported performance metrics, comparisons, and figures are derived from the held-out test set unless otherwise stated.</w:t>
+        <w:t xml:space="preserve">We randomly split the dataset at the participant level into a training set (80%, n = 4,118 ears) and a held-out test set (20%, n = 1,029 ears), stratified by PTA-4 severity grade to keep all WHO categories well represented in both partitions. All membership function optimisation and rule base development were done on the training set alone. All reported performance metrics, comparisons, and figures come from the held-out test set unless stated otherwise.</w:t>
       </w:r>
     </w:p>
     <w:p>
@@ -524,11 +503,11 @@
         <w:t xml:space="preserve"> </w:t>
       </w:r>
       <w:r>
-        <w:t xml:space="preserve">NHANES participants with audiometry data in multiple cycles (n = 120, 4–8 year follow-up window) were identified for temporal trajectory analysis.</w:t>
-      </w:r>
-    </w:p>
-    <w:bookmarkEnd w:id="25"/>
-    <w:bookmarkStart w:id="26" w:name="exploratory-data-analysis"/>
+        <w:t xml:space="preserve">We identified NHANES participants with audiometry data in multiple cycles (n = 120, 4–8 year follow-up window) for temporal trajectory analysis.</w:t>
+      </w:r>
+    </w:p>
+    <w:bookmarkEnd w:id="24"/>
+    <w:bookmarkStart w:id="25" w:name="exploratory-data-analysis"/>
     <w:p>
       <w:pPr>
         <w:pStyle w:val="Heading2"/>
@@ -542,7 +521,7 @@
         <w:pStyle w:val="FirstParagraph"/>
       </w:pPr>
       <w:r>
-        <w:t xml:space="preserve">Comprehensive exploratory analysis of the NHANES audiometry dataset was performed prior to model development. The cohort (n = 5,147 participants, 3,539 ears with complete data after exclusions) had thresholds ranging from −10 to 120 dB HL across all test frequencies.</w:t>
+        <w:t xml:space="preserve">We performed a comprehensive exploratory analysis of the NHANES audiometry dataset before building the model. The cohort (n = 5,147 participants, 3,539 ears with complete data after exclusions) had thresholds from −10 to 120 dB HL across all test frequencies.</w:t>
       </w:r>
     </w:p>
     <w:p>
@@ -560,7 +539,7 @@
         <w:t xml:space="preserve"> </w:t>
       </w:r>
       <w:r>
-        <w:t xml:space="preserve">Hearing thresholds across all frequencies (0.5–8 kHz) exhibited right-skewed distributions with a floor effect at 0–10 dB HL. Mean thresholds increased progressively with frequency: from approximately 17.5 dB HL at 500 Hz to 39.1 dB HL at 8 kHz, consistent with age-related and noise-induced high-frequency hearing loss patterns (Supplementary Figures S1–S2).</w:t>
+        <w:t xml:space="preserve">Hearing thresholds across frequencies (0.5–8 kHz) were right-skewed with a floor effect at 0–10 dB HL. Mean thresholds increased with frequency — from about 17.5 dB HL at 500 Hz to 39.1 dB HL at 8 kHz — consistent with age-related and noise-induced high-frequency hearing loss (Supplementary Figures S1–S2).</w:t>
       </w:r>
     </w:p>
     <w:p>
@@ -578,7 +557,7 @@
         <w:t xml:space="preserve"> </w:t>
       </w:r>
       <w:r>
-        <w:t xml:space="preserve">Using WHO PTA-4 classification, 62.8% of ears had normal hearing (≤25 dB HL), 22.9% mild (26–40 dB), 11.4% moderate (41–55 dB), 2.4% moderately severe (56–70 dB), 0.4% severe (71–90 dB), and &lt;0.1% profound loss (≥91 dB). Critically, 39.2% of all ears fell within ±5 dB of a WHO severity boundary — the borderline population where crisp classification is most ambiguous.</w:t>
+        <w:t xml:space="preserve">Using WHO PTA-4 classification, 62.8% of ears had normal hearing (≤25 dB HL), 22.9% mild (26–40 dB), 11.4% moderate (41–55 dB), 2.4% moderately severe (56–70 dB), 0.4% severe (71–90 dB), and &lt;0.1% profound loss (≥91 dB). About 39.2% of ears fell within ±5 dB of a WHO severity boundary — the borderline population where crisp classification gets most ambiguous.</w:t>
       </w:r>
     </w:p>
     <w:p>
@@ -596,7 +575,7 @@
         <w:t xml:space="preserve"> </w:t>
       </w:r>
       <w:r>
-        <w:t xml:space="preserve">Thresholds at adjacent frequencies were highly correlated (mean adjacent r = 0.87), while correlations between distant frequencies (500 Hz vs. 8 kHz) were moderate (r = 0.46), confirming that frequency-specific information is partially independent and not fully captured by a single PTA value (Supplementary Figure S3).</w:t>
+        <w:t xml:space="preserve">Adjacent frequencies were highly correlated (mean adjacent r = 0.87), while distant frequencies (500 Hz vs. 8 kHz) were only moderately correlated (r = 0.46). This confirms that frequency-specific information is not fully captured by a single PTA value and is worth preserving (Supplementary Figure S3).</w:t>
       </w:r>
     </w:p>
     <w:p>
@@ -614,7 +593,7 @@
         <w:t xml:space="preserve"> </w:t>
       </w:r>
       <w:r>
-        <w:t xml:space="preserve">Using slope-based classification, the most common configurations were flat (36%) and gently sloping (26%), followed by steeply sloping (17%), notched (12%), precipitous (5%), and rising (4%) patterns. This distribution is consistent with a population-based sample where age-related hearing loss predominates (Supplementary Figure S4).</w:t>
+        <w:t xml:space="preserve">Using slope-based classification, the commonest configurations were flat (36%) and gently sloping (26%), followed by steeply sloping (17%), notched (12%), precipitous (5%), and rising (4%). This fits a population-based sample where age-related hearing loss predominates (Supplementary Figure S4).</w:t>
       </w:r>
     </w:p>
     <w:p>
@@ -632,7 +611,7 @@
         <w:t xml:space="preserve"> </w:t>
       </w:r>
       <w:r>
-        <w:t xml:space="preserve">Mean inter-aural asymmetry was 5.5 dB; 5.7% of participants exceeded the 15 dB clinical threshold for significant asymmetry, consistent with published NHANES-based estimates</w:t>
+        <w:t xml:space="preserve">Mean inter-aural asymmetry was 5.5 dB; 5.7% of participants exceeded the 15 dB threshold for significant asymmetry, consistent with published NHANES-based estimates</w:t>
       </w:r>
       <w:r>
         <w:t xml:space="preserve"> </w:t>
@@ -659,11 +638,11 @@
         <w:t xml:space="preserve"> </w:t>
       </w:r>
       <w:r>
-        <w:t xml:space="preserve">Hearing loss severity increased with age, with higher thresholds at high frequencies (4–8 kHz) compared to low frequencies, reflecting known patterns of noise exposure and age-related vulnerability. A complete set of EDA visualisations is provided in the supplementary materials and the analysis repository (https://github.com/ameye/fuzzy-audiogram).</w:t>
-      </w:r>
-    </w:p>
-    <w:bookmarkEnd w:id="26"/>
-    <w:bookmarkStart w:id="27" w:name="fuzzification-membership-functions"/>
+        <w:t xml:space="preserve">Hearing loss severity increased with age, with higher thresholds at high frequencies (4–8 kHz) compared to low frequencies. A complete set of EDA visualisations is in the supplementary materials and the analysis repository (https://github.com/ameye/fuzzy-audiogram).</w:t>
+      </w:r>
+    </w:p>
+    <w:bookmarkEnd w:id="25"/>
+    <w:bookmarkStart w:id="26" w:name="fuzzification-membership-functions"/>
     <w:p>
       <w:pPr>
         <w:pStyle w:val="Heading2"/>
@@ -677,7 +656,7 @@
         <w:pStyle w:val="FirstParagraph"/>
       </w:pPr>
       <w:r>
-        <w:t xml:space="preserve">For each test frequency (500, 1000, 2000, 3000, 4000, 6000, and 8000 Hz), the hearing threshold in dB HL was fuzzified using overlapping trapezoidal membership functions corresponding to six linguistic severity categories:</w:t>
+        <w:t xml:space="preserve">For each test frequency (500, 1000, 2000, 3000, 4000, 6000, and 8000 Hz), we fuzzified the hearing threshold using overlapping trapezoidal membership functions for six linguistic severity categories:</w:t>
       </w:r>
       <w:r>
         <w:t xml:space="preserve"> </w:t>
@@ -755,7 +734,7 @@
         <w:t xml:space="preserve">Profound</w:t>
       </w:r>
       <w:r>
-        <w:t xml:space="preserve">. Trapezoidal functions were chosen over triangular or Gaussian alternatives following a comparative analysis of NHANES training set distributions which revealed asymmetric, plateau-containing distributions within each WHO severity category.</w:t>
+        <w:t xml:space="preserve">. We chose trapezoidal functions over triangular or Gaussian after comparing NHANES training set distributions, which turned out asymmetric and plateau-containing within each WHO severity category — not well captured by symmetric or unimodal alternatives.</w:t>
       </w:r>
     </w:p>
     <w:p>
@@ -763,7 +742,7 @@
         <w:pStyle w:val="BodyText"/>
       </w:pPr>
       <w:r>
-        <w:t xml:space="preserve">The membership functions were defined by a quadruple [a, b, c, d] where the interval [b, c] represents the core region with membership μ = 1.0, and [a, b] and [c, d] represent the left and right shoulders where membership transitions from 0 to 1 or 1 to 0 respectively. The optimised parameters derived from the training set threshold distributions were:</w:t>
+        <w:t xml:space="preserve">Each membership function is defined by a quadruple [a, b, c, d] where [b, c] is the core (membership μ = 1.0), and [a, b] and [c, d] are the left and right shoulders where membership transitions from 0 to 1 or 1 to 0. The optimised parameters from the training set were:</w:t>
       </w:r>
     </w:p>
     <w:tbl>
@@ -1187,7 +1166,7 @@
         <w:pStyle w:val="BodyText"/>
       </w:pPr>
       <w:r>
-        <w:t xml:space="preserve">Each category exhibits approximately 5–10 dB of overlap with its neighbours at the classical WHO boundary points, creating smooth transitions. For example, a threshold of 26 dB HL yields membership μ = 0.40 to</w:t>
+        <w:t xml:space="preserve">Each category overlaps with its neighbours by about 5–10 dB at the classic WHO boundaries, giving smooth transitions. A threshold of 26 dB HL, for example, gives membership μ = 0.40 to</w:t>
       </w:r>
       <w:r>
         <w:t xml:space="preserve"> </w:t>
@@ -1216,7 +1195,10 @@
         <w:t xml:space="preserve">Mild</w:t>
       </w:r>
       <w:r>
-        <w:t xml:space="preserve">, appropriately reflecting its borderline status.</w:t>
+        <w:t xml:space="preserve"> </w:t>
+      </w:r>
+      <w:r>
+        <w:t xml:space="preserve">— reflecting its borderline status more honestly than a forced binary label.</w:t>
       </w:r>
     </w:p>
     <w:p>
@@ -1234,7 +1216,7 @@
         <w:t xml:space="preserve"> </w:t>
       </w:r>
       <w:r>
-        <w:t xml:space="preserve">The slope of the audiogram (dB change from 500 Hz to 4 kHz) was fuzzified into five overlapping categories:</w:t>
+        <w:t xml:space="preserve">We fuzzified the audiogram slope (dB change from 500 Hz to 4 kHz) into five overlapping categories:</w:t>
       </w:r>
       <w:r>
         <w:t xml:space="preserve"> </w:t>
@@ -1314,7 +1296,7 @@
         <w:t xml:space="preserve"> </w:t>
       </w:r>
       <w:r>
-        <w:t xml:space="preserve">(&gt;40 dB). Notch depth at 4 kHz (dip relative to average of 2 kHz and 8 kHz thresholds) was fuzzified as</w:t>
+        <w:t xml:space="preserve">(&gt;40 dB). We fuzzified notch depth at 4 kHz (dip relative to average of 2 kHz and 8 kHz thresholds) as</w:t>
       </w:r>
       <w:r>
         <w:t xml:space="preserve"> </w:t>
@@ -1359,7 +1341,7 @@
         <w:t xml:space="preserve"> </w:t>
       </w:r>
       <w:r>
-        <w:t xml:space="preserve">(≥15 dB), enabling detection of characteristic notched configurations associated with noise-induced hearing loss.</w:t>
+        <w:t xml:space="preserve">(≥15 dB) to catch notched configurations linked to noise-induced hearing loss.</w:t>
       </w:r>
     </w:p>
     <w:p>
@@ -1377,7 +1359,7 @@
         <w:t xml:space="preserve"> </w:t>
       </w:r>
       <w:r>
-        <w:t xml:space="preserve">Inter-aural difference (maximum absolute difference across frequencies) was fuzzified into</w:t>
+        <w:t xml:space="preserve">We fuzzified inter-aural difference (maximum absolute difference across frequencies) into</w:t>
       </w:r>
       <w:r>
         <w:t xml:space="preserve"> </w:t>
@@ -1449,7 +1431,7 @@
         <w:pStyle w:val="BodyText"/>
       </w:pPr>
       <w:r>
-        <w:t xml:space="preserve">The mathematical foundations of fuzzy set theory — including formal definitions of membership functions (trapezoidal MFs), Zadeh set-theoretic operators, Mamdani min–max inference, centroid defuzzification, and the composite FAI computation — are provided in</w:t>
+        <w:t xml:space="preserve">The formal fuzzy set mathematics — membership functions, Zadeh operators, Mamdani min–max inference, centroid defuzzification, and FAI computation — are in</w:t>
       </w:r>
       <w:r>
         <w:t xml:space="preserve"> </w:t>
@@ -1466,8 +1448,8 @@
         <w:t xml:space="preserve">.</w:t>
       </w:r>
     </w:p>
-    <w:bookmarkEnd w:id="27"/>
-    <w:bookmarkStart w:id="28" w:name="fuzzy-inference-system"/>
+    <w:bookmarkEnd w:id="26"/>
+    <w:bookmarkStart w:id="27" w:name="fuzzy-inference-system"/>
     <w:p>
       <w:pPr>
         <w:pStyle w:val="Heading2"/>
@@ -1481,7 +1463,7 @@
         <w:pStyle w:val="FirstParagraph"/>
       </w:pPr>
       <w:r>
-        <w:t xml:space="preserve">A Mamdani-type fuzzy inference system with 48 expert-derived rules was constructed. The rule base was organised into four functional groups:</w:t>
+        <w:t xml:space="preserve">We built a Mamdani-type fuzzy inference system with 48 expert-derived rules organised into four groups:</w:t>
       </w:r>
     </w:p>
     <w:p>
@@ -1502,7 +1484,7 @@
         <w:t xml:space="preserve"> </w:t>
       </w:r>
       <w:r>
-        <w:t xml:space="preserve">Map fuzzified threshold inputs to severity output categories. The primary rules fire the consequent severity category corresponding to the input’s fuzzy membership, while blended rules handle transitional zones where thresholds belong partially to two adjacent categories.</w:t>
+        <w:t xml:space="preserve">Map fuzzified threshold inputs to severity output categories. Primary rules fire the consequent category matching the input’s fuzzy membership; blended rules handle transitional zones where thresholds straddle two adjacent categories.</w:t>
       </w:r>
     </w:p>
     <w:p>
@@ -1523,7 +1505,7 @@
         <w:t xml:space="preserve"> </w:t>
       </w:r>
       <w:r>
-        <w:t xml:space="preserve">Combine slope and notch fuzzifications to classify the audiogram configuration. For example: IF slope is</w:t>
+        <w:t xml:space="preserve">Combine slope and notch fuzzifications to classify audiogram configuration. For example: IF slope is</w:t>
       </w:r>
       <w:r>
         <w:t xml:space="preserve"> </w:t>
@@ -1589,7 +1571,7 @@
         <w:t xml:space="preserve"> </w:t>
       </w:r>
       <w:r>
-        <w:t xml:space="preserve">Map inter-aural differences to asymmetry categories and modulate the severity output for asymmetric presentations.</w:t>
+        <w:t xml:space="preserve">Map inter-aural differences to asymmetry categories and adjust the severity output for asymmetric presentations.</w:t>
       </w:r>
     </w:p>
     <w:p>
@@ -1610,7 +1592,7 @@
         <w:t xml:space="preserve"> </w:t>
       </w:r>
       <w:r>
-        <w:t xml:space="preserve">Address complex presentations where severity, configuration, and asymmetry together suggest mixed aetiology.</w:t>
+        <w:t xml:space="preserve">Handle complex presentations where severity, configuration, and asymmetry together suggest mixed aetiology.</w:t>
       </w:r>
     </w:p>
     <w:p>
@@ -1618,7 +1600,7 @@
         <w:pStyle w:val="FirstParagraph"/>
       </w:pPr>
       <w:r>
-        <w:t xml:space="preserve">Rules use max–min composition with minimum (clipping) implication. Aggregation of multiple rule outputs is performed via fuzzy union (max), and defuzzification uses the centroid of area (CoA) method, yielding a continuous Fuzzy Audiometric Index (FAI) on a 0–100 scale. The FAI is computed per frequency band (FAI</w:t>
+        <w:t xml:space="preserve">Rules use max–min composition with minimum (clipping) implication. We aggregate multiple rule outputs via fuzzy union (max) and defuzzify using the centroid of area (CoA) method, yielding a continuous Fuzzy Audiometric Index (FAI) on a 0–100 scale. The FAI is computed per frequency band (FAI</w:t>
       </w:r>
       <w:r>
         <w:rPr>
@@ -1627,16 +1609,7 @@
         <w:t xml:space="preserve">severity</w:t>
       </w:r>
       <w:r>
-        <w:t xml:space="preserve">) and as a composite (FAI</w:t>
-      </w:r>
-      <w:r>
-        <w:rPr>
-          <w:vertAlign w:val="subscript"/>
-        </w:rPr>
-        <w:t xml:space="preserve">composite</w:t>
-      </w:r>
-      <w:r>
-        <w:t xml:space="preserve">) weighted across frequencies, with enhanced weighting for the speech frequencies (500 Hz–4 kHz, ×1.5) and reduced weighting for extended high frequencies (6–8 kHz, ×0.75).</w:t>
+        <w:t xml:space="preserve">) and as a composite weighted across frequencies, with enhanced weighting for speech frequencies (500 Hz–4 kHz, ×1.5) and reduced weighting for extended high frequencies (6–8 kHz, ×0.75).</w:t>
       </w:r>
     </w:p>
     <w:p>
@@ -1644,11 +1617,11 @@
         <w:pStyle w:val="BodyText"/>
       </w:pPr>
       <w:r>
-        <w:t xml:space="preserve">The system also produces a configuration vector (membership degrees to each of six canonical shapes), an asymmetry index (0–100), and a linguistic summary with associated certainty (firing strength).</w:t>
-      </w:r>
-    </w:p>
-    <w:bookmarkEnd w:id="28"/>
-    <w:bookmarkStart w:id="29" w:name="comparator-models"/>
+        <w:t xml:space="preserve">The system also outputs a configuration vector (membership degrees for each of six canonical shapes), an asymmetry index (0–100), and a linguistic summary with associated firing strength.</w:t>
+      </w:r>
+    </w:p>
+    <w:bookmarkEnd w:id="27"/>
+    <w:bookmarkStart w:id="28" w:name="comparator-models"/>
     <w:p>
       <w:pPr>
         <w:pStyle w:val="Heading2"/>
@@ -1831,7 +1804,7 @@
               <w:pStyle w:val="Compact"/>
             </w:pPr>
             <w:r>
-              <w:t xml:space="preserve">WHO PTA-4 grade used as reference standard for severity classification</w:t>
+              <w:t xml:space="preserve">WHO PTA-4 grade used as reference standard</w:t>
             </w:r>
           </w:p>
         </w:tc>
@@ -1856,8 +1829,8 @@
         <w:t xml:space="preserve">All comparators were evaluated on the held-out test set.</w:t>
       </w:r>
     </w:p>
-    <w:bookmarkEnd w:id="29"/>
-    <w:bookmarkStart w:id="35" w:name="evaluation-metrics"/>
+    <w:bookmarkEnd w:id="28"/>
+    <w:bookmarkStart w:id="33" w:name="evaluation-metrics"/>
     <w:p>
       <w:pPr>
         <w:pStyle w:val="Heading2"/>
@@ -1871,7 +1844,7 @@
         <w:pStyle w:val="FirstParagraph"/>
       </w:pPr>
       <w:r>
-        <w:t xml:space="preserve">Primary evaluation metrics included weighted Cohen’s κ (quadratic weights) for classification agreement, mean absolute error (MAE) for continuous score comparison, and overall accuracy with stratification by borderline (±5 dB of a WHO boundary) versus clear-case status. Configuration classification was evaluated using per-type precision, recall, and F1-score against NHANES-derived configuration labels. Spearman’s rank correlation coefficient (ρ) assessed monotonic association between FAI and PTA-4 values. Bland-Altman analysis with 95% limits of agreement compared FAI against PTA-4.</w:t>
+        <w:t xml:space="preserve">Primary metrics were weighted Cohen’s κ (quadratic weights) for classification agreement, mean absolute error (MAE) for continuous score comparison, and overall accuracy stratified by borderline (±5 dB of a WHO boundary) versus clear-case status. We evaluated configuration classification using per-type precision, recall, and F1-score against NHANES-derived configuration labels. Spearman’s rank correlation (ρ) assessed monotonic association between FAI and PTA-4. Bland-Altman analysis with 95% limits of agreement compared FAI against PTA-4.</w:t>
       </w:r>
     </w:p>
     <w:p>
@@ -1879,12 +1852,12 @@
         <w:pStyle w:val="BodyText"/>
       </w:pPr>
       <w:r>
-        <w:t xml:space="preserve">Subgroup analyses were performed by age decade, audiogram configuration, and degree of hearing loss. All analyses were conducted on the held-out test set in Python using scikit-fuzzy (v0.5.0) for the FIS, scikit-learn (v1.4) for Random Forest, xgboost (v2.0) for gradient boosting, and SciPy (v1.12) for statistical testing. Source code is available at</w:t>
-      </w:r>
-      <w:r>
-        <w:t xml:space="preserve"> </w:t>
-      </w:r>
-      <w:hyperlink r:id="rId30">
+        <w:t xml:space="preserve">We performed subgroup analyses by age decade, audiogram configuration, and degree of hearing loss. All analyses were done on the held-out test set in Python using scikit-fuzzy (v0.5.0) for the FIS, scikit-learn (v1.4) for Random Forest, xgboost (v2.0) for gradient boosting, and SciPy (v1.12) for statistical testing. Source code is at</w:t>
+      </w:r>
+      <w:r>
+        <w:t xml:space="preserve"> </w:t>
+      </w:r>
+      <w:hyperlink r:id="rId29">
         <w:r>
           <w:rPr>
             <w:rStyle w:val="Hyperlink"/>
@@ -1896,103 +1869,97 @@
         <w:t xml:space="preserve">.</w:t>
       </w:r>
     </w:p>
-    <w:tbl>
-      <w:tblPr>
-        <w:tblStyle w:val="Table"/>
-        <w:tblW w:type="pct" w:w="5000"/>
-        <w:tblLayout w:type="fixed"/>
-        <w:tblLook w:firstRow="0" w:lastRow="0" w:firstColumn="0" w:lastColumn="0" w:noHBand="0" w:noVBand="0" w:val="0000"/>
-      </w:tblPr>
-      <w:tblGrid>
-        <w:gridCol w:w="7920"/>
-      </w:tblGrid>
-      <w:tr>
-        <w:tc>
-          <w:tcPr/>
-          <w:bookmarkStart w:id="34" w:name="fig-2"/>
-          <w:p>
-            <w:pPr>
-              <w:pStyle w:val="Compact"/>
-              <w:jc w:val="center"/>
-            </w:pPr>
-            <w:r>
-              <w:drawing>
-                <wp:inline>
-                  <wp:extent cx="5067300" cy="2509902"/>
-                  <wp:effectExtent b="0" l="0" r="0" t="0"/>
-                  <wp:docPr descr="" title="" id="32" name="Picture"/>
-                  <a:graphic>
-                    <a:graphicData uri="http://schemas.openxmlformats.org/drawingml/2006/picture">
-                      <pic:pic>
-                        <pic:nvPicPr>
-                          <pic:cNvPr descr="figures/fig2_fis_architecture.png" id="33" name="Picture"/>
-                          <pic:cNvPicPr>
-                            <a:picLocks noChangeArrowheads="1" noChangeAspect="1"/>
-                          </pic:cNvPicPr>
-                        </pic:nvPicPr>
-                        <pic:blipFill>
-                          <a:blip r:embed="rId31"/>
-                          <a:stretch>
-                            <a:fillRect/>
-                          </a:stretch>
-                        </pic:blipFill>
-                        <pic:spPr bwMode="auto">
-                          <a:xfrm>
-                            <a:off x="0" y="0"/>
-                            <a:ext cx="5067300" cy="2509902"/>
-                          </a:xfrm>
-                          <a:prstGeom prst="rect">
-                            <a:avLst/>
-                          </a:prstGeom>
-                          <a:noFill/>
-                          <a:ln w="9525">
-                            <a:noFill/>
-                            <a:headEnd/>
-                            <a:tailEnd/>
-                          </a:ln>
-                        </pic:spPr>
-                      </pic:pic>
-                    </a:graphicData>
-                  </a:graphic>
-                </wp:inline>
-              </w:drawing>
-            </w:r>
-          </w:p>
-          <w:p>
-            <w:pPr>
-              <w:jc w:val="center"/>
-            </w:pPr>
-            <w:pPr>
-              <w:jc w:val="start"/>
-              <w:spacing w:before="200"/>
-              <w:pStyle w:val="ImageCaption"/>
-            </w:pPr>
-            <w:r>
-              <w:t xml:space="preserve">Figure 2: Mamdani fuzzy inference system architecture. Frequency-specific thresholds → fuzzification (6 overlapping MFs) → 48-rule inference engine → centroid defuzzification → FAI, configuration vector, asymmetry index.</w:t>
-            </w:r>
-          </w:p>
-          <w:bookmarkEnd w:id="34"/>
-        </w:tc>
-      </w:tr>
-    </w:tbl>
+    <w:p>
+      <w:pPr>
+        <w:pStyle w:val="CaptionedFigure"/>
+      </w:pPr>
+      <w:r>
+        <w:drawing>
+          <wp:inline>
+            <wp:extent cx="5067300" cy="2509902"/>
+            <wp:effectExtent b="0" l="0" r="0" t="0"/>
+            <wp:docPr descr="Mamdani fuzzy inference system architecture. Frequency-specific thresholds → fuzzification (6 overlapping MFs) → 48-rule inference engine → centroid defuzzification → FAI, configuration vector, asymmetry index." title="" id="31" name="Picture"/>
+            <a:graphic>
+              <a:graphicData uri="http://schemas.openxmlformats.org/drawingml/2006/picture">
+                <pic:pic>
+                  <pic:nvPicPr>
+                    <pic:cNvPr descr="figures/fig2_fis_architecture.png" id="32" name="Picture"/>
+                    <pic:cNvPicPr>
+                      <a:picLocks noChangeArrowheads="1" noChangeAspect="1"/>
+                    </pic:cNvPicPr>
+                  </pic:nvPicPr>
+                  <pic:blipFill>
+                    <a:blip r:embed="rId30"/>
+                    <a:stretch>
+                      <a:fillRect/>
+                    </a:stretch>
+                  </pic:blipFill>
+                  <pic:spPr bwMode="auto">
+                    <a:xfrm>
+                      <a:off x="0" y="0"/>
+                      <a:ext cx="5067300" cy="2509902"/>
+                    </a:xfrm>
+                    <a:prstGeom prst="rect">
+                      <a:avLst/>
+                    </a:prstGeom>
+                    <a:noFill/>
+                    <a:ln w="9525">
+                      <a:noFill/>
+                      <a:headEnd/>
+                      <a:tailEnd/>
+                    </a:ln>
+                  </pic:spPr>
+                </pic:pic>
+              </a:graphicData>
+            </a:graphic>
+          </wp:inline>
+        </w:drawing>
+      </w:r>
+    </w:p>
+    <w:p>
+      <w:pPr>
+        <w:pStyle w:val="ImageCaption"/>
+      </w:pPr>
+      <w:r>
+        <w:t xml:space="preserve">Mamdani fuzzy inference system architecture. Frequency-specific thresholds → fuzzification (6 overlapping MFs) → 48-rule inference engine → centroid defuzzification → FAI, configuration vector, asymmetry index.</w:t>
+      </w:r>
+    </w:p>
+    <w:bookmarkEnd w:id="33"/>
+    <w:bookmarkEnd w:id="34"/>
+    <w:bookmarkStart w:id="56" w:name="results"/>
+    <w:p>
+      <w:pPr>
+        <w:pStyle w:val="Heading1"/>
+      </w:pPr>
+      <w:r>
+        <w:t xml:space="preserve">3. Results</w:t>
+      </w:r>
+    </w:p>
+    <w:bookmarkStart w:id="35" w:name="cohort-characteristics"/>
+    <w:p>
+      <w:pPr>
+        <w:pStyle w:val="Heading2"/>
+      </w:pPr>
+      <w:r>
+        <w:t xml:space="preserve">3.1 Cohort Characteristics</w:t>
+      </w:r>
+    </w:p>
+    <w:p>
+      <w:pPr>
+        <w:pStyle w:val="FirstParagraph"/>
+      </w:pPr>
+      <w:r>
+        <w:t xml:space="preserve">The NHANES 2017–2020 cohort had 5,147 participants (mean age 49.8 years, 52.3% female) with complete audiometry for at least one ear. The training set (n = 4,118 ears) and held-out test set (n = 1,029 ears) had comparable distributions. In the test set, PTA-4 values were right-skewed: 70.1% normal (≤25 dB HL), 15.0% mild (26–40 dB), 8.0% moderate (41–55 dB), 3.8% moderately severe (56–70 dB), 2.2% severe (71–90 dB), and 0.9% profound loss (≥91 dB).</w:t>
+      </w:r>
+    </w:p>
     <w:bookmarkEnd w:id="35"/>
-    <w:bookmarkEnd w:id="36"/>
-    <w:bookmarkStart w:id="63" w:name="results"/>
-    <w:p>
-      <w:pPr>
-        <w:pStyle w:val="Heading1"/>
-      </w:pPr>
-      <w:r>
-        <w:t xml:space="preserve">3. Results</w:t>
-      </w:r>
-    </w:p>
-    <w:bookmarkStart w:id="37" w:name="cohort-characteristics"/>
+    <w:bookmarkStart w:id="39" w:name="classification-accuracy"/>
     <w:p>
       <w:pPr>
         <w:pStyle w:val="Heading2"/>
       </w:pPr>
       <w:r>
-        <w:t xml:space="preserve">3.1 Cohort Characteristics</w:t>
+        <w:t xml:space="preserve">3.2 Classification Accuracy</w:t>
       </w:r>
     </w:p>
     <w:p>
@@ -2000,112 +1967,62 @@
         <w:pStyle w:val="FirstParagraph"/>
       </w:pPr>
       <w:r>
-        <w:t xml:space="preserve">The NHANES 2017–2020 cohort comprised 5,147 participants (mean age 49.8 years, 52.3% female) with complete audiometry data for at least one ear. The training set (n = 4,118 ears) and held-out test set (n = 1,029 ears) showed comparable distributions. In the test set, the distribution of PTA-4 values was right-skewed: 70.1% had normal hearing (≤25 dB HL), 15.0% mild loss (26–40 dB), 8.0% moderate loss (41–55 dB), 3.8% moderately severe loss (56–70 dB), 2.2% severe loss (71–90 dB), and 0.9% profound loss (≥91 dB).</w:t>
-      </w:r>
-    </w:p>
-    <w:bookmarkEnd w:id="37"/>
-    <w:bookmarkStart w:id="42" w:name="classification-accuracy"/>
-    <w:p>
-      <w:pPr>
-        <w:pStyle w:val="Heading2"/>
-      </w:pPr>
-      <w:r>
-        <w:t xml:space="preserve">3.2 Classification Accuracy</w:t>
-      </w:r>
-    </w:p>
-    <w:p>
-      <w:pPr>
-        <w:pStyle w:val="FirstParagraph"/>
-      </w:pPr>
-      <w:r>
-        <w:t xml:space="preserve">On the held-out test set, the FAI demonstrated weighted Cohen’s κ = 0.89 (95% CI 0.85–0.93) against the WHO PTA-4 consensus reference, indicating excellent agreement.</w:t>
-      </w:r>
-    </w:p>
-    <w:tbl>
-      <w:tblPr>
-        <w:tblStyle w:val="Table"/>
-        <w:tblW w:type="pct" w:w="5000"/>
-        <w:tblLayout w:type="fixed"/>
-        <w:tblLook w:firstRow="0" w:lastRow="0" w:firstColumn="0" w:lastColumn="0" w:noHBand="0" w:noVBand="0" w:val="0000"/>
-      </w:tblPr>
-      <w:tblGrid>
-        <w:gridCol w:w="7920"/>
-      </w:tblGrid>
-      <w:tr>
-        <w:tc>
-          <w:tcPr/>
-          <w:bookmarkStart w:id="41" w:name="fig-3"/>
-          <w:p>
-            <w:pPr>
-              <w:pStyle w:val="Compact"/>
-              <w:jc w:val="center"/>
-            </w:pPr>
-            <w:r>
-              <w:drawing>
-                <wp:inline>
-                  <wp:extent cx="4267200" cy="3182778"/>
-                  <wp:effectExtent b="0" l="0" r="0" t="0"/>
-                  <wp:docPr descr="" title="" id="39" name="Picture"/>
-                  <a:graphic>
-                    <a:graphicData uri="http://schemas.openxmlformats.org/drawingml/2006/picture">
-                      <pic:pic>
-                        <pic:nvPicPr>
-                          <pic:cNvPr descr="figures/fig3_bland_altman.png" id="40" name="Picture"/>
-                          <pic:cNvPicPr>
-                            <a:picLocks noChangeArrowheads="1" noChangeAspect="1"/>
-                          </pic:cNvPicPr>
-                        </pic:nvPicPr>
-                        <pic:blipFill>
-                          <a:blip r:embed="rId38"/>
-                          <a:stretch>
-                            <a:fillRect/>
-                          </a:stretch>
-                        </pic:blipFill>
-                        <pic:spPr bwMode="auto">
-                          <a:xfrm>
-                            <a:off x="0" y="0"/>
-                            <a:ext cx="4267200" cy="3182778"/>
-                          </a:xfrm>
-                          <a:prstGeom prst="rect">
-                            <a:avLst/>
-                          </a:prstGeom>
-                          <a:noFill/>
-                          <a:ln w="9525">
-                            <a:noFill/>
-                            <a:headEnd/>
-                            <a:tailEnd/>
-                          </a:ln>
-                        </pic:spPr>
-                      </pic:pic>
-                    </a:graphicData>
-                  </a:graphic>
-                </wp:inline>
-              </w:drawing>
-            </w:r>
-          </w:p>
-          <w:p>
-            <w:pPr>
-              <w:jc w:val="center"/>
-            </w:pPr>
-            <w:pPr>
-              <w:jc w:val="start"/>
-              <w:spacing w:before="200"/>
-              <w:pStyle w:val="ImageCaption"/>
-            </w:pPr>
-            <w:r>
-              <w:t xml:space="preserve">Figure 3: Bland-Altman plot showing agreement between FAI and PTA-4 reference on the held-out test set.</w:t>
-            </w:r>
-          </w:p>
-          <w:bookmarkEnd w:id="41"/>
-        </w:tc>
-      </w:tr>
-    </w:tbl>
-    <w:p>
-      <w:pPr>
-        <w:pStyle w:val="BodyText"/>
-      </w:pPr>
-      <w:r>
-        <w:t xml:space="preserve"> </w:t>
+        <w:t xml:space="preserve">On the held-out test set, the FAI showed weighted Cohen’s κ = 0.89 (95% CI 0.85–0.93) against the WHO PTA-4 consensus reference — excellent agreement.</w:t>
+      </w:r>
+    </w:p>
+    <w:p>
+      <w:pPr>
+        <w:pStyle w:val="CaptionedFigure"/>
+      </w:pPr>
+      <w:r>
+        <w:drawing>
+          <wp:inline>
+            <wp:extent cx="4267200" cy="3182778"/>
+            <wp:effectExtent b="0" l="0" r="0" t="0"/>
+            <wp:docPr descr="Bland-Altman plot showing agreement between FAI and PTA-4 reference on the held-out test set." title="" id="37" name="Picture"/>
+            <a:graphic>
+              <a:graphicData uri="http://schemas.openxmlformats.org/drawingml/2006/picture">
+                <pic:pic>
+                  <pic:nvPicPr>
+                    <pic:cNvPr descr="figures/fig3_bland_altman.png" id="38" name="Picture"/>
+                    <pic:cNvPicPr>
+                      <a:picLocks noChangeArrowheads="1" noChangeAspect="1"/>
+                    </pic:cNvPicPr>
+                  </pic:nvPicPr>
+                  <pic:blipFill>
+                    <a:blip r:embed="rId36"/>
+                    <a:stretch>
+                      <a:fillRect/>
+                    </a:stretch>
+                  </pic:blipFill>
+                  <pic:spPr bwMode="auto">
+                    <a:xfrm>
+                      <a:off x="0" y="0"/>
+                      <a:ext cx="4267200" cy="3182778"/>
+                    </a:xfrm>
+                    <a:prstGeom prst="rect">
+                      <a:avLst/>
+                    </a:prstGeom>
+                    <a:noFill/>
+                    <a:ln w="9525">
+                      <a:noFill/>
+                      <a:headEnd/>
+                      <a:tailEnd/>
+                    </a:ln>
+                  </pic:spPr>
+                </pic:pic>
+              </a:graphicData>
+            </a:graphic>
+          </wp:inline>
+        </w:drawing>
+      </w:r>
+    </w:p>
+    <w:p>
+      <w:pPr>
+        <w:pStyle w:val="ImageCaption"/>
+      </w:pPr>
+      <w:r>
+        <w:t xml:space="preserve">Bland-Altman plot showing agreement between FAI and PTA-4 reference on the held-out test set.</w:t>
       </w:r>
     </w:p>
     <w:tbl>
@@ -2367,17 +2284,17 @@
         <w:pStyle w:val="BodyText"/>
       </w:pPr>
       <w:r>
-        <w:t xml:space="preserve">The FAI significantly outperformed PTA-4 classification specifically in the borderline zone (McNemar’s test, p &lt; 0.01). The advantage was most pronounced within ±3 dB of a severity boundary, where PTA-4 accuracy fell to 61.2% while FAI accuracy remained above 88%. Results for XGBoost and Random Forest were intermediate between FAI and PTA-4 but lacked the interpretability of the fuzzy rule base.</w:t>
-      </w:r>
-    </w:p>
-    <w:bookmarkEnd w:id="42"/>
-    <w:bookmarkStart w:id="47" w:name="X2b0d5c2a26fe846e9dffeec6b6e27897a257f84"/>
+        <w:t xml:space="preserve">The FAI significantly outperformed PTA-4 classification in the borderline zone (McNemar’s test, p &lt; 0.01). The gap was widest within ±3 dB of a severity boundary, where PTA-4 accuracy dropped to 61.2% while FAI stayed above 88%. XGBoost and Random Forest fell between FAI and PTA-4 but lacked the interpretability of the fuzzy rule base.</w:t>
+      </w:r>
+    </w:p>
+    <w:bookmarkEnd w:id="39"/>
+    <w:bookmarkStart w:id="43" w:name="the-2526-db-boundary-a-closer-look"/>
     <w:p>
       <w:pPr>
         <w:pStyle w:val="Heading2"/>
       </w:pPr>
       <w:r>
-        <w:t xml:space="preserve">3.3 The 25/26 dB Boundary: A Focused Comparison</w:t>
+        <w:t xml:space="preserve">3.3 The 25/26 dB Boundary: A Closer Look</w:t>
       </w:r>
     </w:p>
     <w:p>
@@ -2385,7 +2302,7 @@
         <w:pStyle w:val="FirstParagraph"/>
       </w:pPr>
       <w:r>
-        <w:t xml:space="preserve">To illustrate the clinical relevance of the fuzzy approach, we examined classification at the critical normal/mild boundary:</w:t>
+        <w:t xml:space="preserve">To show what this means clinically, we looked at classification at the normal/mild boundary:</w:t>
       </w:r>
     </w:p>
     <w:tbl>
@@ -2751,90 +2668,66 @@
         <w:pStyle w:val="BodyText"/>
       </w:pPr>
       <w:r>
-        <w:t xml:space="preserve">The fuzzy system reveals that a patient with PTA of 24 dB is simultaneously 60% normal and 67% mild — reflecting the inherent ambiguity that the crisp binary label obscures. The FAI score of 19.0 at 24 dB rises smoothly to 30.0 at 30 dB, in contrast to the step change at 26 dB imposed by crisp rules.</w:t>
-      </w:r>
-    </w:p>
-    <w:tbl>
-      <w:tblPr>
-        <w:tblStyle w:val="Table"/>
-        <w:tblW w:type="pct" w:w="5000"/>
-        <w:tblLayout w:type="fixed"/>
-        <w:tblLook w:firstRow="0" w:lastRow="0" w:firstColumn="0" w:lastColumn="0" w:noHBand="0" w:noVBand="0" w:val="0000"/>
-      </w:tblPr>
-      <w:tblGrid>
-        <w:gridCol w:w="7920"/>
-      </w:tblGrid>
-      <w:tr>
-        <w:tc>
-          <w:tcPr/>
-          <w:bookmarkStart w:id="46" w:name="fig-5"/>
-          <w:p>
-            <w:pPr>
-              <w:pStyle w:val="Compact"/>
-              <w:jc w:val="center"/>
-            </w:pPr>
-            <w:r>
-              <w:drawing>
-                <wp:inline>
-                  <wp:extent cx="4267200" cy="2640567"/>
-                  <wp:effectExtent b="0" l="0" r="0" t="0"/>
-                  <wp:docPr descr="" title="" id="44" name="Picture"/>
-                  <a:graphic>
-                    <a:graphicData uri="http://schemas.openxmlformats.org/drawingml/2006/picture">
-                      <pic:pic>
-                        <pic:nvPicPr>
-                          <pic:cNvPr descr="figures/fig5_borderline_analysis.png" id="45" name="Picture"/>
-                          <pic:cNvPicPr>
-                            <a:picLocks noChangeArrowheads="1" noChangeAspect="1"/>
-                          </pic:cNvPicPr>
-                        </pic:nvPicPr>
-                        <pic:blipFill>
-                          <a:blip r:embed="rId43"/>
-                          <a:stretch>
-                            <a:fillRect/>
-                          </a:stretch>
-                        </pic:blipFill>
-                        <pic:spPr bwMode="auto">
-                          <a:xfrm>
-                            <a:off x="0" y="0"/>
-                            <a:ext cx="4267200" cy="2640567"/>
-                          </a:xfrm>
-                          <a:prstGeom prst="rect">
-                            <a:avLst/>
-                          </a:prstGeom>
-                          <a:noFill/>
-                          <a:ln w="9525">
-                            <a:noFill/>
-                            <a:headEnd/>
-                            <a:tailEnd/>
-                          </a:ln>
-                        </pic:spPr>
-                      </pic:pic>
-                    </a:graphicData>
-                  </a:graphic>
-                </wp:inline>
-              </w:drawing>
-            </w:r>
-          </w:p>
-          <w:p>
-            <w:pPr>
-              <w:jc w:val="center"/>
-            </w:pPr>
-            <w:pPr>
-              <w:jc w:val="start"/>
-              <w:spacing w:before="200"/>
-              <w:pStyle w:val="ImageCaption"/>
-            </w:pPr>
-            <w:r>
-              <w:t xml:space="preserve">Figure 4: Borderline case analysis: classification accuracy as a function of distance from the nearest WHO severity boundary. FAI maintains &gt;88% accuracy across all distances; PTA accuracy drops to 61% within ±3 dB of a boundary.</w:t>
-            </w:r>
-          </w:p>
-          <w:bookmarkEnd w:id="46"/>
-        </w:tc>
-      </w:tr>
-    </w:tbl>
-    <w:bookmarkEnd w:id="47"/>
-    <w:bookmarkStart w:id="52" w:name="clinical-case-studies"/>
+        <w:t xml:space="preserve">The fuzzy system shows that a patient with a PTA of 24 dB is simultaneously 60% normal and 67% mild — the crisp label obscures this ambiguity. The FAI rises smoothly from 19.0 at 24 dB to 30.0 at 30 dB, unlike the step change at 26 dB that crisp rules impose.</w:t>
+      </w:r>
+    </w:p>
+    <w:p>
+      <w:pPr>
+        <w:pStyle w:val="CaptionedFigure"/>
+      </w:pPr>
+      <w:r>
+        <w:drawing>
+          <wp:inline>
+            <wp:extent cx="4267200" cy="2640567"/>
+            <wp:effectExtent b="0" l="0" r="0" t="0"/>
+            <wp:docPr descr="Borderline case analysis: classification accuracy as a function of distance from the nearest WHO severity boundary. FAI maintains &gt;88% accuracy across all distances; PTA accuracy drops to 61% within ±3 dB of a boundary." title="" id="41" name="Picture"/>
+            <a:graphic>
+              <a:graphicData uri="http://schemas.openxmlformats.org/drawingml/2006/picture">
+                <pic:pic>
+                  <pic:nvPicPr>
+                    <pic:cNvPr descr="figures/fig5_borderline_analysis.png" id="42" name="Picture"/>
+                    <pic:cNvPicPr>
+                      <a:picLocks noChangeArrowheads="1" noChangeAspect="1"/>
+                    </pic:cNvPicPr>
+                  </pic:nvPicPr>
+                  <pic:blipFill>
+                    <a:blip r:embed="rId40"/>
+                    <a:stretch>
+                      <a:fillRect/>
+                    </a:stretch>
+                  </pic:blipFill>
+                  <pic:spPr bwMode="auto">
+                    <a:xfrm>
+                      <a:off x="0" y="0"/>
+                      <a:ext cx="4267200" cy="2640567"/>
+                    </a:xfrm>
+                    <a:prstGeom prst="rect">
+                      <a:avLst/>
+                    </a:prstGeom>
+                    <a:noFill/>
+                    <a:ln w="9525">
+                      <a:noFill/>
+                      <a:headEnd/>
+                      <a:tailEnd/>
+                    </a:ln>
+                  </pic:spPr>
+                </pic:pic>
+              </a:graphicData>
+            </a:graphic>
+          </wp:inline>
+        </w:drawing>
+      </w:r>
+    </w:p>
+    <w:p>
+      <w:pPr>
+        <w:pStyle w:val="ImageCaption"/>
+      </w:pPr>
+      <w:r>
+        <w:t xml:space="preserve">Borderline case analysis: classification accuracy as a function of distance from the nearest WHO severity boundary. FAI maintains &gt;88% accuracy across all distances; PTA accuracy drops to 61% within ±3 dB of a boundary.</w:t>
+      </w:r>
+    </w:p>
+    <w:bookmarkEnd w:id="43"/>
+    <w:bookmarkStart w:id="47" w:name="clinical-case-studies"/>
     <w:p>
       <w:pPr>
         <w:pStyle w:val="Heading2"/>
@@ -2848,7 +2741,7 @@
         <w:pStyle w:val="FirstParagraph"/>
       </w:pPr>
       <w:r>
-        <w:t xml:space="preserve">To illustrate the clinical utility of the fuzzy framework, we present four representative cases drawn from the NHANES dataset (Figure 4).</w:t>
+        <w:t xml:space="preserve">We picked four cases from the NHANES dataset to illustrate how the fuzzy framework works in practice (Figure 4).</w:t>
       </w:r>
     </w:p>
     <w:p>
@@ -2866,7 +2759,7 @@
         <w:t xml:space="preserve"> </w:t>
       </w:r>
       <w:r>
-        <w:t xml:space="preserve">Borderline mild–moderate hearing loss with a 25-year history of occupational noise exposure. PTA-4 was 27.5 dB (classified as</w:t>
+        <w:t xml:space="preserve">Borderline mild–moderate hearing loss with 25 years of occupational noise exposure. PTA-4 was 27.5 dB (WHO:</w:t>
       </w:r>
       <w:r>
         <w:t xml:space="preserve"> </w:t>
@@ -2878,7 +2771,7 @@
         <w:t xml:space="preserve"> </w:t>
       </w:r>
       <w:r>
-        <w:t xml:space="preserve">by WHO criteria but borderline). The FIS returned FAI = 26.3 (mild), with membership degrees Normal μ = 0.25 and Mild μ = 1.00. Configuration classification identified the audiogram as intermediate between flat and gently sloping. The fuzzy output appropriately reflected both the borderline severity and the frequency-specific variation that the PTA discards.</w:t>
+        <w:t xml:space="preserve">but borderline). The FIS gave FAI = 26.3 (mild), with membership Normal μ = 0.25 and Mild μ = 1.00. Configuration classification put the audiogram between flat and gently sloping. The fuzzy output captured both the borderline severity and the frequency-specific variation that the PTA misses.</w:t>
       </w:r>
     </w:p>
     <w:p>
@@ -2896,7 +2789,7 @@
         <w:t xml:space="preserve"> </w:t>
       </w:r>
       <w:r>
-        <w:t xml:space="preserve">Noise-induced notched configuration with thresholds of 10, 10, 12, 20, 35, 50, 45, and 30 dB HL (250–8000 Hz). PTA-4 was 23.0 dB — classified as</w:t>
+        <w:t xml:space="preserve">Noise-induced notched configuration with thresholds of 10, 10, 12, 20, 35, 50, 45, and 30 dB HL (250–8000 Hz). PTA-4 was 23.0 dB — labelled</w:t>
       </w:r>
       <w:r>
         <w:t xml:space="preserve"> </w:t>
@@ -2908,7 +2801,7 @@
         <w:t xml:space="preserve"> </w:t>
       </w:r>
       <w:r>
-        <w:t xml:space="preserve">Yet there is functionally significant high-frequency loss typical of noise exposure. The FIS returned FAI = 19.5 (Normal composite), but importantly identified a notch depth of 25.0 dB at 4 kHz and configuration membership predominantly in the</w:t>
+        <w:t xml:space="preserve">But there is functionally significant high-frequency loss here. The FIS returned FAI = 19.5 (Normal composite) but identified a notch depth of 25.0 dB at 4 kHz and configuration membership leaning heavily</w:t>
       </w:r>
       <w:r>
         <w:t xml:space="preserve"> </w:t>
@@ -2924,7 +2817,7 @@
         <w:t xml:space="preserve"> </w:t>
       </w:r>
       <w:r>
-        <w:t xml:space="preserve">category. The configuration vector revealed that the audiogram was 78% notched and 22% sloping — capturing the pattern that the PTA masked.</w:t>
+        <w:t xml:space="preserve">(78%). The PTA completely missed this.</w:t>
       </w:r>
     </w:p>
     <w:p>
@@ -2942,7 +2835,7 @@
         <w:t xml:space="preserve"> </w:t>
       </w:r>
       <w:r>
-        <w:t xml:space="preserve">Presbycusis with a gently sloping high-frequency loss (thresholds 15–70 dB HL across the frequency range). PTA-4 was 33.8 dB (Mild). The FIS returned FAI = 30.0 (Mild), configuration = Sloping, slope = 35 dB — consistent with the classical age-related hearing loss pattern. The FIS correctly graded the loss as mild overall while preserving the frequency-specific gradient.</w:t>
+        <w:t xml:space="preserve">Presbycusis with a gently sloping high-frequency loss (thresholds 15–70 dB HL). PTA-4 was 33.8 dB (Mild). The FIS returned FAI = 30.0 (Mild), configuration = Sloping, slope = 35 dB — classic age-related pattern. The FIS graded the loss as mild overall while preserving the frequency-specific gradient.</w:t>
       </w:r>
     </w:p>
     <w:p>
@@ -2960,7 +2853,7 @@
         <w:t xml:space="preserve"> </w:t>
       </w:r>
       <w:r>
-        <w:t xml:space="preserve">Asymmetric sensorineural loss with right ear PTA-4 of 53.8 dB (Moderate) and left ear PTA-4 of 28.8 dB (Mild). The asymmetry index of 30.0 dB placed the presentation in the</w:t>
+        <w:t xml:space="preserve">Asymmetric sensorineural loss — right ear PTA-4 53.8 dB (Moderate), left ear 28.8 dB (Mild). The asymmetry index of 30.0 dB placed this in the</w:t>
       </w:r>
       <w:r>
         <w:t xml:space="preserve"> </w:t>
@@ -2976,7 +2869,7 @@
         <w:t xml:space="preserve"> </w:t>
       </w:r>
       <w:r>
-        <w:t xml:space="preserve">category, with the FAI adjusting the left ear rating upward to 42.2 (Moderate) to reflect the clinical significance of the asymmetry. This illustrates how the fuzzy system captures the functional impact of asymmetric loss that conventional ear-specific PTA classification overlooks.</w:t>
+        <w:t xml:space="preserve">category, and the FAI adjusted the left ear rating up to 42.2 (Moderate) to reflect the clinical significance of the asymmetry. This shows how the fuzzy system captures the functional impact of asymmetric loss that ear-specific PTA classification overlooks.</w:t>
       </w:r>
     </w:p>
     <w:tbl>
@@ -3340,99 +3233,148 @@
     </w:tbl>
     <w:p>
       <w:pPr>
+        <w:pStyle w:val="CaptionedFigure"/>
+      </w:pPr>
+      <w:r>
+        <w:drawing>
+          <wp:inline>
+            <wp:extent cx="5334000" cy="4673819"/>
+            <wp:effectExtent b="0" l="0" r="0" t="0"/>
+            <wp:docPr descr="Clinical case studies. (A) Borderline mild—PTA 27.5 dB but FAI reveals graded membership. (B) Noise-induced notch—normal PTA but 25 dB notch at 4 kHz. (C) Presbycusis—gently sloping high-frequency loss. (D) Asymmetric loss—30 dB inter-aural difference. Right panels show membership degree bar charts. Grey bands indicate WHO severity categories." title="" id="45" name="Picture"/>
+            <a:graphic>
+              <a:graphicData uri="http://schemas.openxmlformats.org/drawingml/2006/picture">
+                <pic:pic>
+                  <pic:nvPicPr>
+                    <pic:cNvPr descr="figures/fig4_clinical_cases.png" id="46" name="Picture"/>
+                    <pic:cNvPicPr>
+                      <a:picLocks noChangeArrowheads="1" noChangeAspect="1"/>
+                    </pic:cNvPicPr>
+                  </pic:nvPicPr>
+                  <pic:blipFill>
+                    <a:blip r:embed="rId44"/>
+                    <a:stretch>
+                      <a:fillRect/>
+                    </a:stretch>
+                  </pic:blipFill>
+                  <pic:spPr bwMode="auto">
+                    <a:xfrm>
+                      <a:off x="0" y="0"/>
+                      <a:ext cx="5334000" cy="4673819"/>
+                    </a:xfrm>
+                    <a:prstGeom prst="rect">
+                      <a:avLst/>
+                    </a:prstGeom>
+                    <a:noFill/>
+                    <a:ln w="9525">
+                      <a:noFill/>
+                      <a:headEnd/>
+                      <a:tailEnd/>
+                    </a:ln>
+                  </pic:spPr>
+                </pic:pic>
+              </a:graphicData>
+            </a:graphic>
+          </wp:inline>
+        </w:drawing>
+      </w:r>
+    </w:p>
+    <w:p>
+      <w:pPr>
+        <w:pStyle w:val="ImageCaption"/>
+      </w:pPr>
+      <w:r>
+        <w:t xml:space="preserve">Clinical case studies. (A) Borderline mild—PTA 27.5 dB but FAI reveals graded membership. (B) Noise-induced notch—normal PTA but 25 dB notch at 4 kHz. (C) Presbycusis—gently sloping high-frequency loss. (D) Asymmetric loss—30 dB inter-aural difference. Right panels show membership degree bar charts. Grey bands indicate WHO severity categories.</w:t>
+      </w:r>
+    </w:p>
+    <w:bookmarkEnd w:id="47"/>
+    <w:bookmarkStart w:id="51" w:name="configuration-classification"/>
+    <w:p>
+      <w:pPr>
+        <w:pStyle w:val="Heading2"/>
+      </w:pPr>
+      <w:r>
+        <w:t xml:space="preserve">3.5 Configuration Classification</w:t>
+      </w:r>
+    </w:p>
+    <w:p>
+      <w:pPr>
+        <w:pStyle w:val="FirstParagraph"/>
+      </w:pPr>
+      <w:r>
+        <w:t xml:space="preserve">Configuration classification hit 89.4% overall agreement against NHANES-derived labels (κ = 0.86). Per-type accuracy was highest for flat (94.2%) and sloping (91.5%), intermediate for precipitous (86.3%) and notched (84.1%), and lowest for rising (72.3%, small sample, n = 38). The main confusion was between gently sloping and steeply sloping patterns — not surprising given slope rate is continuous.</w:t>
+      </w:r>
+    </w:p>
+    <w:p>
+      <w:pPr>
         <w:pStyle w:val="BodyText"/>
       </w:pPr>
       <w:r>
-        <w:t xml:space="preserve"> </w:t>
-      </w:r>
-    </w:p>
-    <w:tbl>
-      <w:tblPr>
-        <w:tblStyle w:val="Table"/>
-        <w:tblW w:type="pct" w:w="5000"/>
-        <w:tblLayout w:type="fixed"/>
-        <w:tblLook w:firstRow="0" w:lastRow="0" w:firstColumn="0" w:lastColumn="0" w:noHBand="0" w:noVBand="0" w:val="0000"/>
-      </w:tblPr>
-      <w:tblGrid>
-        <w:gridCol w:w="7920"/>
-      </w:tblGrid>
-      <w:tr>
-        <w:tc>
-          <w:tcPr/>
-          <w:bookmarkStart w:id="51" w:name="fig-4"/>
-          <w:p>
-            <w:pPr>
-              <w:pStyle w:val="Compact"/>
-              <w:jc w:val="center"/>
-            </w:pPr>
-            <w:r>
-              <w:drawing>
-                <wp:inline>
-                  <wp:extent cx="5334000" cy="4673819"/>
-                  <wp:effectExtent b="0" l="0" r="0" t="0"/>
-                  <wp:docPr descr="" title="" id="49" name="Picture"/>
-                  <a:graphic>
-                    <a:graphicData uri="http://schemas.openxmlformats.org/drawingml/2006/picture">
-                      <pic:pic>
-                        <pic:nvPicPr>
-                          <pic:cNvPr descr="figures/fig4_clinical_cases.png" id="50" name="Picture"/>
-                          <pic:cNvPicPr>
-                            <a:picLocks noChangeArrowheads="1" noChangeAspect="1"/>
-                          </pic:cNvPicPr>
-                        </pic:nvPicPr>
-                        <pic:blipFill>
-                          <a:blip r:embed="rId48"/>
-                          <a:stretch>
-                            <a:fillRect/>
-                          </a:stretch>
-                        </pic:blipFill>
-                        <pic:spPr bwMode="auto">
-                          <a:xfrm>
-                            <a:off x="0" y="0"/>
-                            <a:ext cx="5334000" cy="4673819"/>
-                          </a:xfrm>
-                          <a:prstGeom prst="rect">
-                            <a:avLst/>
-                          </a:prstGeom>
-                          <a:noFill/>
-                          <a:ln w="9525">
-                            <a:noFill/>
-                            <a:headEnd/>
-                            <a:tailEnd/>
-                          </a:ln>
-                        </pic:spPr>
-                      </pic:pic>
-                    </a:graphicData>
-                  </a:graphic>
-                </wp:inline>
-              </w:drawing>
-            </w:r>
-          </w:p>
-          <w:p>
-            <w:pPr>
-              <w:jc w:val="center"/>
-            </w:pPr>
-            <w:pPr>
-              <w:jc w:val="start"/>
-              <w:spacing w:before="200"/>
-              <w:pStyle w:val="ImageCaption"/>
-            </w:pPr>
-            <w:r>
-              <w:t xml:space="preserve">Figure 5: Clinical case studies. (A) Borderline mild—PTA 27.5 dB but FAI reveals graded membership. (B) Noise-induced notch—normal PTA but 25 dB notch at 4 kHz. (C) Presbycusis—gently sloping high-frequency loss. (D) Asymmetric loss—30 dB inter-aural difference. Right panels show membership degree bar charts for each case. Grey bands indicate WHO severity categories.</w:t>
-            </w:r>
-          </w:p>
-          <w:bookmarkEnd w:id="51"/>
-        </w:tc>
-      </w:tr>
-    </w:tbl>
-    <w:bookmarkEnd w:id="52"/>
-    <w:bookmarkStart w:id="57" w:name="configuration-classification"/>
+        <w:t xml:space="preserve">Configuration distribution in the cohort was predominantly flat (34%) and sloping (28%), with smaller proportions of steeply sloping (18%), notched (11%), precipitous (5%), and rising (4%) patterns — consistent with a general population sample.</w:t>
+      </w:r>
+    </w:p>
+    <w:p>
+      <w:pPr>
+        <w:pStyle w:val="CaptionedFigure"/>
+      </w:pPr>
+      <w:r>
+        <w:drawing>
+          <wp:inline>
+            <wp:extent cx="4267200" cy="3634392"/>
+            <wp:effectExtent b="0" l="0" r="0" t="0"/>
+            <wp:docPr descr="Configuration classification confusion matrix. Overall accuracy: 89.4% (κ = 0.86). Primary confusion between gently sloping and steeply sloping patterns." title="" id="49" name="Picture"/>
+            <a:graphic>
+              <a:graphicData uri="http://schemas.openxmlformats.org/drawingml/2006/picture">
+                <pic:pic>
+                  <pic:nvPicPr>
+                    <pic:cNvPr descr="figures/fig6_confusion_matrix.png" id="50" name="Picture"/>
+                    <pic:cNvPicPr>
+                      <a:picLocks noChangeArrowheads="1" noChangeAspect="1"/>
+                    </pic:cNvPicPr>
+                  </pic:nvPicPr>
+                  <pic:blipFill>
+                    <a:blip r:embed="rId48"/>
+                    <a:stretch>
+                      <a:fillRect/>
+                    </a:stretch>
+                  </pic:blipFill>
+                  <pic:spPr bwMode="auto">
+                    <a:xfrm>
+                      <a:off x="0" y="0"/>
+                      <a:ext cx="4267200" cy="3634392"/>
+                    </a:xfrm>
+                    <a:prstGeom prst="rect">
+                      <a:avLst/>
+                    </a:prstGeom>
+                    <a:noFill/>
+                    <a:ln w="9525">
+                      <a:noFill/>
+                      <a:headEnd/>
+                      <a:tailEnd/>
+                    </a:ln>
+                  </pic:spPr>
+                </pic:pic>
+              </a:graphicData>
+            </a:graphic>
+          </wp:inline>
+        </w:drawing>
+      </w:r>
+    </w:p>
+    <w:p>
+      <w:pPr>
+        <w:pStyle w:val="ImageCaption"/>
+      </w:pPr>
+      <w:r>
+        <w:t xml:space="preserve">Configuration classification confusion matrix. Overall accuracy: 89.4% (κ = 0.86). Primary confusion between gently sloping and steeply sloping patterns.</w:t>
+      </w:r>
+    </w:p>
+    <w:bookmarkEnd w:id="51"/>
+    <w:bookmarkStart w:id="55" w:name="temporal-tracking"/>
     <w:p>
       <w:pPr>
         <w:pStyle w:val="Heading2"/>
       </w:pPr>
       <w:r>
-        <w:t xml:space="preserve">3.5 Configuration Classification</w:t>
+        <w:t xml:space="preserve">3.6 Temporal Tracking</w:t>
       </w:r>
     </w:p>
     <w:p>
@@ -3440,7 +3382,90 @@
         <w:pStyle w:val="FirstParagraph"/>
       </w:pPr>
       <w:r>
-        <w:t xml:space="preserve">Configuration classification demonstrated 89.4% overall agreement against NHANES-derived configuration labels (κ = 0.86). Per-type accuracy was highest for flat (94.2%) and sloping (91.5%) configurations, intermediate for precipitous (86.3%) and notched (84.1%), and lowest for rising (72.3%, small sample, n = 38). The primary confusion was between gently sloping and steeply sloping patterns — expected given the continuous nature of slope rate.</w:t>
+        <w:t xml:space="preserve">In the 120-participant longitudinal sub-cohort, FAI trajectories showed smoother progression than PTA-based staging. Mean annual FAI change was +1.7/year in the age-related hearing loss subgroup. By comparison, PTA grade changed by one category every 4.2 years on average — reflecting the stepwise nature of discrete transitions. Notably, 28% of participants showed FAI changes of ≥5 points without crossing a PTA boundary. These are sub-threshold progressions the crisp system would miss. They included both worsening (e.g., ototoxicity during chemotherapy) and improvement (e.g., recovery after acute noise exposure).</w:t>
+      </w:r>
+    </w:p>
+    <w:p>
+      <w:pPr>
+        <w:pStyle w:val="CaptionedFigure"/>
+      </w:pPr>
+      <w:r>
+        <w:drawing>
+          <wp:inline>
+            <wp:extent cx="5067300" cy="1640687"/>
+            <wp:effectExtent b="0" l="0" r="0" t="0"/>
+            <wp:docPr descr="Longitudinal FAI trajectories for three clinical scenarios. FAI (coloured lines) shows smooth, continuous progression while PTA grade (grey steps) changes only at boundary crossings." title="" id="53" name="Picture"/>
+            <a:graphic>
+              <a:graphicData uri="http://schemas.openxmlformats.org/drawingml/2006/picture">
+                <pic:pic>
+                  <pic:nvPicPr>
+                    <pic:cNvPr descr="figures/fig7_longitudinal.png" id="54" name="Picture"/>
+                    <pic:cNvPicPr>
+                      <a:picLocks noChangeArrowheads="1" noChangeAspect="1"/>
+                    </pic:cNvPicPr>
+                  </pic:nvPicPr>
+                  <pic:blipFill>
+                    <a:blip r:embed="rId52"/>
+                    <a:stretch>
+                      <a:fillRect/>
+                    </a:stretch>
+                  </pic:blipFill>
+                  <pic:spPr bwMode="auto">
+                    <a:xfrm>
+                      <a:off x="0" y="0"/>
+                      <a:ext cx="5067300" cy="1640687"/>
+                    </a:xfrm>
+                    <a:prstGeom prst="rect">
+                      <a:avLst/>
+                    </a:prstGeom>
+                    <a:noFill/>
+                    <a:ln w="9525">
+                      <a:noFill/>
+                      <a:headEnd/>
+                      <a:tailEnd/>
+                    </a:ln>
+                  </pic:spPr>
+                </pic:pic>
+              </a:graphicData>
+            </a:graphic>
+          </wp:inline>
+        </w:drawing>
+      </w:r>
+    </w:p>
+    <w:p>
+      <w:pPr>
+        <w:pStyle w:val="ImageCaption"/>
+      </w:pPr>
+      <w:r>
+        <w:t xml:space="preserve">Longitudinal FAI trajectories for three clinical scenarios. FAI (coloured lines) shows smooth, continuous progression while PTA grade (grey steps) changes only at boundary crossings.</w:t>
+      </w:r>
+    </w:p>
+    <w:bookmarkEnd w:id="55"/>
+    <w:bookmarkEnd w:id="56"/>
+    <w:bookmarkStart w:id="62" w:name="discussion"/>
+    <w:p>
+      <w:pPr>
+        <w:pStyle w:val="Heading1"/>
+      </w:pPr>
+      <w:r>
+        <w:t xml:space="preserve">4. Discussion</w:t>
+      </w:r>
+    </w:p>
+    <w:bookmarkStart w:id="57" w:name="principal-findings"/>
+    <w:p>
+      <w:pPr>
+        <w:pStyle w:val="Heading2"/>
+      </w:pPr>
+      <w:r>
+        <w:t xml:space="preserve">4.1 Principal Findings</w:t>
+      </w:r>
+    </w:p>
+    <w:p>
+      <w:pPr>
+        <w:pStyle w:val="FirstParagraph"/>
+      </w:pPr>
+      <w:r>
+        <w:t xml:space="preserve">This study shows that a Mamdani-type fuzzy inference system can classify audiometric data with more gradation than conventional PTA-based classification. The FAI hit κ = 0.89 against the WHO PTA-4 reference and 91% accuracy in borderline cases where PTA-based classification managed only 68%. The system’s main advantage is in the clinical scenarios where crisp classification is most uncertain — patients whose thresholds fall near the classic severity boundaries.</w:t>
       </w:r>
     </w:p>
     <w:p>
@@ -3448,223 +3473,11 @@
         <w:pStyle w:val="BodyText"/>
       </w:pPr>
       <w:r>
-        <w:t xml:space="preserve">Configuration distribution in the NHANES cohort showed predominantly flat (34%) and sloping (28%) configurations, with smaller proportions of steeply sloping (18%), notched (11%), precipitous (5%), and rising (4%) patterns, consistent with a population-based sample.</w:t>
-      </w:r>
-    </w:p>
-    <w:tbl>
-      <w:tblPr>
-        <w:tblStyle w:val="Table"/>
-        <w:tblW w:type="pct" w:w="5000"/>
-        <w:tblLayout w:type="fixed"/>
-        <w:tblLook w:firstRow="0" w:lastRow="0" w:firstColumn="0" w:lastColumn="0" w:noHBand="0" w:noVBand="0" w:val="0000"/>
-      </w:tblPr>
-      <w:tblGrid>
-        <w:gridCol w:w="7920"/>
-      </w:tblGrid>
-      <w:tr>
-        <w:tc>
-          <w:tcPr/>
-          <w:bookmarkStart w:id="56" w:name="fig-6"/>
-          <w:p>
-            <w:pPr>
-              <w:pStyle w:val="Compact"/>
-              <w:jc w:val="center"/>
-            </w:pPr>
-            <w:r>
-              <w:drawing>
-                <wp:inline>
-                  <wp:extent cx="4267200" cy="3634392"/>
-                  <wp:effectExtent b="0" l="0" r="0" t="0"/>
-                  <wp:docPr descr="" title="" id="54" name="Picture"/>
-                  <a:graphic>
-                    <a:graphicData uri="http://schemas.openxmlformats.org/drawingml/2006/picture">
-                      <pic:pic>
-                        <pic:nvPicPr>
-                          <pic:cNvPr descr="figures/fig6_confusion_matrix.png" id="55" name="Picture"/>
-                          <pic:cNvPicPr>
-                            <a:picLocks noChangeArrowheads="1" noChangeAspect="1"/>
-                          </pic:cNvPicPr>
-                        </pic:nvPicPr>
-                        <pic:blipFill>
-                          <a:blip r:embed="rId53"/>
-                          <a:stretch>
-                            <a:fillRect/>
-                          </a:stretch>
-                        </pic:blipFill>
-                        <pic:spPr bwMode="auto">
-                          <a:xfrm>
-                            <a:off x="0" y="0"/>
-                            <a:ext cx="4267200" cy="3634392"/>
-                          </a:xfrm>
-                          <a:prstGeom prst="rect">
-                            <a:avLst/>
-                          </a:prstGeom>
-                          <a:noFill/>
-                          <a:ln w="9525">
-                            <a:noFill/>
-                            <a:headEnd/>
-                            <a:tailEnd/>
-                          </a:ln>
-                        </pic:spPr>
-                      </pic:pic>
-                    </a:graphicData>
-                  </a:graphic>
-                </wp:inline>
-              </w:drawing>
-            </w:r>
-          </w:p>
-          <w:p>
-            <w:pPr>
-              <w:jc w:val="center"/>
-            </w:pPr>
-            <w:pPr>
-              <w:jc w:val="start"/>
-              <w:spacing w:before="200"/>
-              <w:pStyle w:val="ImageCaption"/>
-            </w:pPr>
-            <w:r>
-              <w:t xml:space="preserve">Figure 6: Configuration classification confusion matrix. Overall accuracy: 89.4% (κ = 0.86). Primary confusion between gently sloping and steeply sloping patterns.</w:t>
-            </w:r>
-          </w:p>
-          <w:bookmarkEnd w:id="56"/>
-        </w:tc>
-      </w:tr>
-    </w:tbl>
+        <w:t xml:space="preserve">The configuration classification component adds a dimension of clinical information the PTA cannot capture. Detecting notched configurations in noise-induced hearing loss (Case B) despite a normal PTA shows how the fuzzy system uncovers functionally significant pathology that standard classification misses. The asymmetry index similarly provides a continuous metric for a clinical feature usually treated as a binary flag.</w:t>
+      </w:r>
+    </w:p>
     <w:bookmarkEnd w:id="57"/>
-    <w:bookmarkStart w:id="62" w:name="temporal-tracking"/>
-    <w:p>
-      <w:pPr>
-        <w:pStyle w:val="Heading2"/>
-      </w:pPr>
-      <w:r>
-        <w:t xml:space="preserve">3.6 Temporal Tracking</w:t>
-      </w:r>
-    </w:p>
-    <w:p>
-      <w:pPr>
-        <w:pStyle w:val="FirstParagraph"/>
-      </w:pPr>
-      <w:r>
-        <w:t xml:space="preserve">In the 120-participant longitudinal sub-cohort, FAI trajectories demonstrated smoother progression than PTA-based staging. Mean annual FAI change was +1.7/year in the age-related hearing loss subgroup. In comparison, PTA grade changed by one category every 4.2 years on average, reflecting the stepwise nature of discrete grade transitions. Importantly, 28% of participants showed FAI changes of ≥5 points without crossing a PTA boundary — sub-threshold progression that the crisp system would miss. These included both worsening (e.g., ototoxicity in chemotherapy patients) and improvement (e.g., recovery after acute noise exposure).</w:t>
-      </w:r>
-    </w:p>
-    <w:tbl>
-      <w:tblPr>
-        <w:tblStyle w:val="Table"/>
-        <w:tblW w:type="pct" w:w="5000"/>
-        <w:tblLayout w:type="fixed"/>
-        <w:tblLook w:firstRow="0" w:lastRow="0" w:firstColumn="0" w:lastColumn="0" w:noHBand="0" w:noVBand="0" w:val="0000"/>
-      </w:tblPr>
-      <w:tblGrid>
-        <w:gridCol w:w="7920"/>
-      </w:tblGrid>
-      <w:tr>
-        <w:tc>
-          <w:tcPr/>
-          <w:bookmarkStart w:id="61" w:name="fig-7"/>
-          <w:p>
-            <w:pPr>
-              <w:pStyle w:val="Compact"/>
-              <w:jc w:val="center"/>
-            </w:pPr>
-            <w:r>
-              <w:drawing>
-                <wp:inline>
-                  <wp:extent cx="5067300" cy="1640687"/>
-                  <wp:effectExtent b="0" l="0" r="0" t="0"/>
-                  <wp:docPr descr="" title="" id="59" name="Picture"/>
-                  <a:graphic>
-                    <a:graphicData uri="http://schemas.openxmlformats.org/drawingml/2006/picture">
-                      <pic:pic>
-                        <pic:nvPicPr>
-                          <pic:cNvPr descr="figures/fig7_longitudinal.png" id="60" name="Picture"/>
-                          <pic:cNvPicPr>
-                            <a:picLocks noChangeArrowheads="1" noChangeAspect="1"/>
-                          </pic:cNvPicPr>
-                        </pic:nvPicPr>
-                        <pic:blipFill>
-                          <a:blip r:embed="rId58"/>
-                          <a:stretch>
-                            <a:fillRect/>
-                          </a:stretch>
-                        </pic:blipFill>
-                        <pic:spPr bwMode="auto">
-                          <a:xfrm>
-                            <a:off x="0" y="0"/>
-                            <a:ext cx="5067300" cy="1640687"/>
-                          </a:xfrm>
-                          <a:prstGeom prst="rect">
-                            <a:avLst/>
-                          </a:prstGeom>
-                          <a:noFill/>
-                          <a:ln w="9525">
-                            <a:noFill/>
-                            <a:headEnd/>
-                            <a:tailEnd/>
-                          </a:ln>
-                        </pic:spPr>
-                      </pic:pic>
-                    </a:graphicData>
-                  </a:graphic>
-                </wp:inline>
-              </w:drawing>
-            </w:r>
-          </w:p>
-          <w:p>
-            <w:pPr>
-              <w:jc w:val="center"/>
-            </w:pPr>
-            <w:pPr>
-              <w:jc w:val="start"/>
-              <w:spacing w:before="200"/>
-              <w:pStyle w:val="ImageCaption"/>
-            </w:pPr>
-            <w:r>
-              <w:t xml:space="preserve">Figure 7: Longitudinal FAI trajectories for three clinical scenarios. FAI (coloured lines) shows smooth, continuous progression while PTA grade (grey steps) changes only at boundary crossings.</w:t>
-            </w:r>
-          </w:p>
-          <w:bookmarkEnd w:id="61"/>
-        </w:tc>
-      </w:tr>
-    </w:tbl>
-    <w:bookmarkEnd w:id="62"/>
-    <w:bookmarkEnd w:id="63"/>
-    <w:bookmarkStart w:id="69" w:name="discussion"/>
-    <w:p>
-      <w:pPr>
-        <w:pStyle w:val="Heading1"/>
-      </w:pPr>
-      <w:r>
-        <w:t xml:space="preserve">4. Discussion</w:t>
-      </w:r>
-    </w:p>
-    <w:bookmarkStart w:id="64" w:name="principal-findings"/>
-    <w:p>
-      <w:pPr>
-        <w:pStyle w:val="Heading2"/>
-      </w:pPr>
-      <w:r>
-        <w:t xml:space="preserve">4.1 Principal Findings</w:t>
-      </w:r>
-    </w:p>
-    <w:p>
-      <w:pPr>
-        <w:pStyle w:val="FirstParagraph"/>
-      </w:pPr>
-      <w:r>
-        <w:t xml:space="preserve">This study demonstrates that a Mamdani-type fuzzy inference system can classify audiometric data with gradation that provides richer, more nuanced information than conventional PTA-based classification. The Fuzzy Audiometric Index (FAI) achieved κ = 0.89 against the WHO PTA-4 reference and showed 91% accuracy in borderline cases where PTA-based classification achieved only 68%. The system’s primary advantage lies in precisely the clinical scenarios where crisp classification is most uncertain — patients whose thresholds fall near the classic severity boundaries.</w:t>
-      </w:r>
-    </w:p>
-    <w:p>
-      <w:pPr>
-        <w:pStyle w:val="BodyText"/>
-      </w:pPr>
-      <w:r>
-        <w:t xml:space="preserve">The configuration classification component adds a second dimension of clinical information not captured by the PTA. Detection of notched configurations in noise-induced hearing loss (Case B) despite a normal PTA illustrates how the fuzzy system uncovers functionally significant pathology that standard classification would miss. Similarly, the asymmetry index provides a continuous metric for a clinical feature typically treated as a binary flag.</w:t>
-      </w:r>
-    </w:p>
-    <w:bookmarkEnd w:id="64"/>
-    <w:bookmarkStart w:id="65" w:name="clinical-implications"/>
+    <w:bookmarkStart w:id="58" w:name="clinical-implications"/>
     <w:p>
       <w:pPr>
         <w:pStyle w:val="Heading2"/>
@@ -3688,19 +3501,7 @@
         <w:t xml:space="preserve"> </w:t>
       </w:r>
       <w:r>
-        <w:t xml:space="preserve">The FAI could refine referral pathways by identifying patients who straddle severity boundaries — for example, a patient with FAI = 45 (borderline mild–moderate) might be classified as</w:t>
-      </w:r>
-      <w:r>
-        <w:t xml:space="preserve"> </w:t>
-      </w:r>
-      <w:r>
-        <w:t xml:space="preserve">“borderline”</w:t>
-      </w:r>
-      <w:r>
-        <w:t xml:space="preserve"> </w:t>
-      </w:r>
-      <w:r>
-        <w:t xml:space="preserve">and scheduled for monitoring rather than forced into a single category that under- or over-states their loss.</w:t>
+        <w:t xml:space="preserve">The FAI could refine referral pathways by flagging patients who straddle severity boundaries — someone with FAI = 45 (borderline mild–moderate) might be scheduled for monitoring rather than forced into a single category that either under- or over-states their loss.</w:t>
       </w:r>
     </w:p>
     <w:p>
@@ -3718,7 +3519,7 @@
         <w:t xml:space="preserve"> </w:t>
       </w:r>
       <w:r>
-        <w:t xml:space="preserve">Continuous severity scores map naturally to gain parameters. Current prescriptive methods (NAL-NL2, DSL) use PTA-derived compression ratios that change discretely at severity boundaries. A fuzzy configuration vector could guide frequency-specific amplification more precisely, particularly for notched or sloping patterns where the PTA is a poor summary.</w:t>
+        <w:t xml:space="preserve">Continuous severity scores map naturally to gain parameters. Current prescriptive methods (NAL-NL2, DSL) use PTA-derived compression ratios that change discretely at severity boundaries. A fuzzy configuration vector could guide frequency-specific amplification more precisely — especially for notched or sloping patterns where the PTA is a poor summary.</w:t>
       </w:r>
     </w:p>
     <w:p>
@@ -3736,7 +3537,7 @@
         <w:t xml:space="preserve"> </w:t>
       </w:r>
       <w:r>
-        <w:t xml:space="preserve">In cisplatin chemotherapy or aminoglycoside therapy, early detection of threshold shifts is critical. The temporal tracking module detected sub-threshold FAI changes of ≥5 points in 28% of the longitudinal cohort without crossing a PTA boundary — representing early warning signals for ototoxicity that the conventional system would miss until irreversible damage had occurred.</w:t>
+        <w:t xml:space="preserve">Early detection of threshold shifts during cisplatin chemotherapy or aminoglycoside therapy is critical. The temporal tracking module picked up sub-threshold FAI changes of ≥5 points in 28% of the longitudinal cohort without crossing a PTA boundary. These are early warning signals the conventional system would miss until irreversible damage has set in.</w:t>
       </w:r>
     </w:p>
     <w:p>
@@ -3754,17 +3555,164 @@
         <w:t xml:space="preserve"> </w:t>
       </w:r>
       <w:r>
-        <w:t xml:space="preserve">In sub-Saharan African countries where specialist audiology expertise is scarce, a fuzzy classification system deployed on mobile audiometry platforms (hearWHO, Mimi Hearing Test) could provide more informative triage than the current binary pass/fail or simple PTA-based classifications. The framework’s interpretability and low computational requirements make it suitable for deployment in settings where specialist audiology expertise is scarce.</w:t>
+        <w:t xml:space="preserve">In sub-Saharan African countries where specialist audiology expertise is scarce, a fuzzy classification system deployed on mobile audiometry platforms (hearWHO, Mimi Hearing Test) could provide more informative triage than the current binary pass/fail or simple PTA-based classifications. The framework is interpretable and computationally light — it does not need much to run.</w:t>
+      </w:r>
+    </w:p>
+    <w:bookmarkEnd w:id="58"/>
+    <w:bookmarkStart w:id="59" w:name="comparison-with-prior-work"/>
+    <w:p>
+      <w:pPr>
+        <w:pStyle w:val="Heading2"/>
+      </w:pPr>
+      <w:r>
+        <w:t xml:space="preserve">4.3 Comparison with Prior Work</w:t>
+      </w:r>
+    </w:p>
+    <w:p>
+      <w:pPr>
+        <w:pStyle w:val="FirstParagraph"/>
+      </w:pPr>
+      <w:r>
+        <w:t xml:space="preserve">Our results fit with the emerging computational audiology literature while extending it in a few directions. The 91% borderline accuracy compares well with the 87% from Miller and Polansky</w:t>
+      </w:r>
+      <w:r>
+        <w:t xml:space="preserve"> </w:t>
+      </w:r>
+      <w:r>
+        <w:t xml:space="preserve">(Miller and Polansky 2004)</w:t>
+      </w:r>
+      <w:r>
+        <w:t xml:space="preserve"> </w:t>
+      </w:r>
+      <w:r>
+        <w:t xml:space="preserve">and the 91% from Chen et al.</w:t>
+      </w:r>
+      <w:r>
+        <w:t xml:space="preserve"> </w:t>
+      </w:r>
+      <w:r>
+        <w:t xml:space="preserve">(Chen et al. 2017)</w:t>
+      </w:r>
+      <w:r>
+        <w:t xml:space="preserve">, though direct comparison is limited by different datasets and outcome definitions. We also found that the fuzzy system outperformed XGBoost in borderline cases (91% vs. 79%, p &lt; 0.05). Machine learning classifiers are not designed to model partial membership at severity boundaries — fuzzy logic is mathematically structured to do exactly that.</w:t>
+      </w:r>
+    </w:p>
+    <w:p>
+      <w:pPr>
+        <w:pStyle w:val="BodyText"/>
+      </w:pPr>
+      <w:r>
+        <w:t xml:space="preserve">Compared to clustering-based profiling approaches</w:t>
+      </w:r>
+      <w:r>
+        <w:t xml:space="preserve"> </w:t>
+      </w:r>
+      <w:r>
+        <w:t xml:space="preserve">(Sanchez-Lopez et al. 2021; Van Beek et al. 2024)</w:t>
+      </w:r>
+      <w:r>
+        <w:t xml:space="preserve">, the fuzzy system produces outputs clinicians can actually inspect — see the rule base, understand why a particular grade was assigned, and modify rules if needed. That transparency matters for real clinical adoption.</w:t>
+      </w:r>
+    </w:p>
+    <w:bookmarkEnd w:id="59"/>
+    <w:bookmarkStart w:id="60" w:name="limitations"/>
+    <w:p>
+      <w:pPr>
+        <w:pStyle w:val="Heading2"/>
+      </w:pPr>
+      <w:r>
+        <w:t xml:space="preserve">4.4 Limitations</w:t>
+      </w:r>
+    </w:p>
+    <w:p>
+      <w:pPr>
+        <w:pStyle w:val="FirstParagraph"/>
+      </w:pPr>
+      <w:r>
+        <w:t xml:space="preserve">A few limitations deserve mention. First, we used air-conduction thresholds only. Detecting mixed versus sensorineural loss needs bone-conduction inputs as separate fuzzy variables — we plan to add these. Second, the rule base, though grounded in audiology expertise, has not been through formal Delphi consensus with a large panel of experts. Third, NHANES data, while population-based, mostly reflects mild-to-moderate age-related hearing loss and may underrepresent certain configurations (e.g., steeply sloping losses from Menière’s disease). Fourth, we did not cover extended high-frequency audiometry (10–16 kHz), which matters for ototoxicity monitoring. Fifth, the reference standard is the WHO PTA-4 classification itself — it is the clinical gold standard, but it carries the same boundary problem the fuzzy system is trying to solve. Finally, we have not yet assessed whether the FAI predicts hearing aid outcomes, patient-reported benefit, or surgical candidacy.</w:t>
+      </w:r>
+    </w:p>
+    <w:bookmarkEnd w:id="60"/>
+    <w:bookmarkStart w:id="61" w:name="generalisability-and-future-directions"/>
+    <w:p>
+      <w:pPr>
+        <w:pStyle w:val="Heading2"/>
+      </w:pPr>
+      <w:r>
+        <w:t xml:space="preserve">4.5 Generalisability and Future Directions</w:t>
+      </w:r>
+    </w:p>
+    <w:p>
+      <w:pPr>
+        <w:pStyle w:val="FirstParagraph"/>
+      </w:pPr>
+      <w:r>
+        <w:t xml:space="preserve">The fuzzy framework is portable by design — the same architecture can take additional inputs (speech audiometry, otoacoustic emissions, patient-reported outcomes) by adding new membership functions and rules. Going forward, we plan to: (a) validate against NHANES-derived consensus labels and prospective clinical datasets; (b) do multi-site validation including paediatric and Menière’s cohorts; (c) integrate with mobile audiometry platforms for community-based hearing screening in low-resource settings; (d) build a web-based FAI Calculator with REST API for EHR integration; (e) explore neuro-fuzzy approaches (ANFIS) that learn rule parameters from data while staying interpretable; (f) run prospective clinical trials using FAI as an endpoint for hearing preservation interventions; and (g) use the FAI as a continuous graded feature for training machine learning models that need audiometric input — its smooth 0–100 gradient, frequency-resolved output, and interpretable rule base make it a promising intermediate representation for models predicting speech-in-noise performance, hearing aid outcomes, or cochlear implant candidacy.</w:t>
+      </w:r>
+    </w:p>
+    <w:bookmarkEnd w:id="61"/>
+    <w:bookmarkEnd w:id="62"/>
+    <w:bookmarkStart w:id="63" w:name="conclusion"/>
+    <w:p>
+      <w:pPr>
+        <w:pStyle w:val="Heading1"/>
+      </w:pPr>
+      <w:r>
+        <w:t xml:space="preserve">5. Conclusion</w:t>
+      </w:r>
+    </w:p>
+    <w:p>
+      <w:pPr>
+        <w:pStyle w:val="FirstParagraph"/>
+      </w:pPr>
+      <w:r>
+        <w:t xml:space="preserve">The Fuzzy Audiometric Index (FAI) gives a continuous, frequency-resolved, interpretable classification of hearing loss that preserves the gradation lost to crisp PTA thresholds. Validated on a held-out NHANES test set (n = 1,029 ears), it shows high agreement with WHO PTA-4 classification while providing richer information on borderline cases, configuration typing, and longitudinal monitoring. As audiology moves toward more personalised, data-driven care, fuzzy logic offers a transparent way to keep the inherent continuity of auditory function front and centre.</w:t>
+      </w:r>
+    </w:p>
+    <w:bookmarkEnd w:id="63"/>
+    <w:bookmarkStart w:id="64" w:name="acknowledgements"/>
+    <w:p>
+      <w:pPr>
+        <w:pStyle w:val="Heading1"/>
+      </w:pPr>
+      <w:r>
+        <w:t xml:space="preserve">6. Acknowledgements</w:t>
+      </w:r>
+    </w:p>
+    <w:p>
+      <w:pPr>
+        <w:pStyle w:val="FirstParagraph"/>
+      </w:pPr>
+      <w:r>
+        <w:t xml:space="preserve">NHANES data were provided by the U.S. Centers for Disease Control and Prevention, National Center for Health Statistics. The author thanks the developers of scikit-fuzzy and the open-source Python ecosystem for making this analysis possible.</w:t>
+      </w:r>
+    </w:p>
+    <w:bookmarkEnd w:id="64"/>
+    <w:bookmarkStart w:id="65" w:name="conflict-of-interest-statement"/>
+    <w:p>
+      <w:pPr>
+        <w:pStyle w:val="Heading1"/>
+      </w:pPr>
+      <w:r>
+        <w:t xml:space="preserve">7. Conflict of Interest Statement</w:t>
+      </w:r>
+    </w:p>
+    <w:p>
+      <w:pPr>
+        <w:pStyle w:val="FirstParagraph"/>
+      </w:pPr>
+      <w:r>
+        <w:t xml:space="preserve">The author declares no conflicts of interest.</w:t>
       </w:r>
     </w:p>
     <w:bookmarkEnd w:id="65"/>
-    <w:bookmarkStart w:id="66" w:name="comparison-with-prior-work"/>
-    <w:p>
-      <w:pPr>
-        <w:pStyle w:val="Heading2"/>
-      </w:pPr>
-      <w:r>
-        <w:t xml:space="preserve">4.3 Comparison with Prior Work</w:t>
+    <w:bookmarkStart w:id="66" w:name="data-availability"/>
+    <w:p>
+      <w:pPr>
+        <w:pStyle w:val="Heading1"/>
+      </w:pPr>
+      <w:r>
+        <w:t xml:space="preserve">8. Data Availability</w:t>
       </w:r>
     </w:p>
     <w:p>
@@ -3772,167 +3720,20 @@
         <w:pStyle w:val="FirstParagraph"/>
       </w:pPr>
       <w:r>
-        <w:t xml:space="preserve">Our results are consistent with the emerging literature on computational audiology while extending it in several directions. The 91% accuracy of the fuzzy system in borderline cases compares favourably with the 87% reported by Miller and Polansky</w:t>
-      </w:r>
-      <w:r>
-        <w:t xml:space="preserve"> </w:t>
-      </w:r>
-      <w:r>
-        <w:t xml:space="preserve">(Miller and Polansky 2004)</w:t>
-      </w:r>
-      <w:r>
-        <w:t xml:space="preserve"> </w:t>
-      </w:r>
-      <w:r>
-        <w:t xml:space="preserve">and the 91% reported by Chen et al.</w:t>
-      </w:r>
-      <w:r>
-        <w:t xml:space="preserve"> </w:t>
-      </w:r>
-      <w:r>
-        <w:t xml:space="preserve">(Chen et al. 2017)</w:t>
-      </w:r>
-      <w:r>
-        <w:t xml:space="preserve">, though direct comparison is limited by different datasets and outcome definitions. Our finding that the fuzzy system outperforms XGBoost in borderline cases (91% vs. 79%, p &lt; 0.05) is notable: machine learning classifiers, while powerful, are not explicitly designed to model the partial-membership nature of severity boundaries, whereas fuzzy logic is mathematically structured to do so.</w:t>
-      </w:r>
-    </w:p>
-    <w:p>
-      <w:pPr>
-        <w:pStyle w:val="BodyText"/>
-      </w:pPr>
-      <w:r>
-        <w:t xml:space="preserve">Compared to clustering-based auditory profiling approaches</w:t>
-      </w:r>
-      <w:r>
-        <w:t xml:space="preserve"> </w:t>
-      </w:r>
-      <w:r>
-        <w:t xml:space="preserve">(Sanchez-Lopez et al. 2021; Van Beek et al. 2024)</w:t>
-      </w:r>
-      <w:r>
-        <w:t xml:space="preserve">, the fuzzy system produces explicitly interpretable outputs — clinicians can inspect the rule base, understand why a particular grade was assigned, and modify rules if needed. This transparency is essential for clinical adoption in audiology.</w:t>
+        <w:t xml:space="preserve">NHANES data are publicly available at https://www.cdc.gov/nchs/nhanes/. Analysis source code is at https://github.com/ameye/fuzzy-audiogram.</w:t>
       </w:r>
     </w:p>
     <w:bookmarkEnd w:id="66"/>
-    <w:bookmarkStart w:id="67" w:name="limitations"/>
-    <w:p>
-      <w:pPr>
-        <w:pStyle w:val="Heading2"/>
-      </w:pPr>
-      <w:r>
-        <w:t xml:space="preserve">4.4 Limitations</w:t>
-      </w:r>
-    </w:p>
-    <w:p>
-      <w:pPr>
-        <w:pStyle w:val="FirstParagraph"/>
-      </w:pPr>
-      <w:r>
-        <w:t xml:space="preserve">Several limitations warrant acknowledgement. First, the current system uses air-conduction thresholds only. Detection of mixed versus sensorineural loss requires bone-conduction inputs as separate fuzzy variables, which will be incorporated in a future iteration. Second, the rule base, while derived from audiology expertise and refined through iterative testing, has not undergone formal Delphi consensus by a large panel of clinical experts. Third, NHANES data, while population-based, predominantly reflects mild-to-moderate age-related hearing loss and may underrepresent certain configurations (e.g., steeply sloping losses due to Menière’s disease). Fourth, extended high-frequency audiometry (10–16 kHz), which is important for ototoxicity monitoring, is not covered by the current 0.5–8 kHz frequency range. Fifth, the reference standard for validation is the WHO PTA-4 classification itself — although this is the clinical gold standard, it inherits the same boundary problem the fuzzy system seeks to address. Finally, the clinical utility of FAI for predicting hearing aid outcomes, patient-reported benefit, or surgical candidacy has not yet been assessed.</w:t>
-      </w:r>
-    </w:p>
-    <w:bookmarkEnd w:id="67"/>
-    <w:bookmarkStart w:id="68" w:name="generalisability-and-future-directions"/>
-    <w:p>
-      <w:pPr>
-        <w:pStyle w:val="Heading2"/>
-      </w:pPr>
-      <w:r>
-        <w:t xml:space="preserve">4.5 Generalisability and Future Directions</w:t>
-      </w:r>
-    </w:p>
-    <w:p>
-      <w:pPr>
-        <w:pStyle w:val="FirstParagraph"/>
-      </w:pPr>
-      <w:r>
-        <w:t xml:space="preserve">The fuzzy framework is inherently portable: the same architecture can accommodate additional inputs (speech audiometry, otoacoustic emissions, patient-reported outcome measures) through the addition of new membership functions and rules. Future work will focus on: (a) validation against NHANES-derived consensus labels and prospective clinical datasets; (b) multi-site validation including paediatric and Menière’s cohorts; (c) integration with mobile audiometry platforms for community-based hearing screening in low-resource settings; (d) development of a web-based FAI Calculator with REST API for electronic health record integration; (e) neuro-fuzzy approaches (ANFIS) that learn rule parameters from data while retaining interpretability; (f) prospective clinical trials using FAI as an endpoint for hearing preservation interventions; and (g) use of the FAI as a continuous, graded feature for training machine learning models that require audiometric input. The FAI’s smooth gradient (0–100), frequency-resolved output, and interpretable rule base make it a promising intermediate representation for models predicting speech-in-noise performance, hearing aid outcomes, or cochlear implant candidacy, where crisp PTA grades provide limited discriminatory power.</w:t>
-      </w:r>
-    </w:p>
-    <w:bookmarkEnd w:id="68"/>
-    <w:bookmarkEnd w:id="69"/>
-    <w:bookmarkStart w:id="70" w:name="conclusion"/>
+    <w:bookmarkStart w:id="72" w:name="sec-app-math"/>
     <w:p>
       <w:pPr>
         <w:pStyle w:val="Heading1"/>
       </w:pPr>
       <w:r>
-        <w:t xml:space="preserve">5. Conclusion</w:t>
-      </w:r>
-    </w:p>
-    <w:p>
-      <w:pPr>
-        <w:pStyle w:val="FirstParagraph"/>
-      </w:pPr>
-      <w:r>
-        <w:t xml:space="preserve">The Fuzzy Audiometric Index (FAI) provides a continuous, frequency-resolved, interpretable classification of hearing loss that preserves the gradation lost to crisp PTA thresholds. Validated on a held-out NHANES test set (n = 1,029 ears), the FAI demonstrates high agreement with WHO PTA-4 classification while offering richer information on borderline cases, configuration typing, and longitudinal monitoring. As audiology moves toward personalised, data-driven care, fuzzy logic offers a mathematically principled yet clinically transparent framework for preserving the inherent continuity of auditory function.</w:t>
-      </w:r>
-    </w:p>
-    <w:bookmarkEnd w:id="70"/>
-    <w:bookmarkStart w:id="71" w:name="acknowledgements"/>
-    <w:p>
-      <w:pPr>
-        <w:pStyle w:val="Heading1"/>
-      </w:pPr>
-      <w:r>
-        <w:t xml:space="preserve">6. Acknowledgements</w:t>
-      </w:r>
-    </w:p>
-    <w:p>
-      <w:pPr>
-        <w:pStyle w:val="FirstParagraph"/>
-      </w:pPr>
-      <w:r>
-        <w:t xml:space="preserve">NHANES data were provided by the U.S. Centers for Disease Control and Prevention, National Center for Health Statistics. The author thanks the developers of scikit-fuzzy and the open-source Python ecosystem for making this analysis possible.</w:t>
-      </w:r>
-    </w:p>
-    <w:bookmarkEnd w:id="71"/>
-    <w:bookmarkStart w:id="72" w:name="conflict-of-interest-statement"/>
-    <w:p>
-      <w:pPr>
-        <w:pStyle w:val="Heading1"/>
-      </w:pPr>
-      <w:r>
-        <w:t xml:space="preserve">7. Conflict of Interest Statement</w:t>
-      </w:r>
-    </w:p>
-    <w:p>
-      <w:pPr>
-        <w:pStyle w:val="FirstParagraph"/>
-      </w:pPr>
-      <w:r>
-        <w:t xml:space="preserve">The author declares no conflicts of interest.</w:t>
-      </w:r>
-    </w:p>
-    <w:bookmarkEnd w:id="72"/>
-    <w:bookmarkStart w:id="73" w:name="data-availability"/>
-    <w:p>
-      <w:pPr>
-        <w:pStyle w:val="Heading1"/>
-      </w:pPr>
-      <w:r>
-        <w:t xml:space="preserve">8. Data Availability</w:t>
-      </w:r>
-    </w:p>
-    <w:p>
-      <w:pPr>
-        <w:pStyle w:val="FirstParagraph"/>
-      </w:pPr>
-      <w:r>
-        <w:t xml:space="preserve">NHANES data are publicly available at https://www.cdc.gov/nchs/nhanes/. Analysis source code is available at https://github.com/ameye/fuzzy-audiogram.</w:t>
-      </w:r>
-    </w:p>
-    <w:bookmarkEnd w:id="73"/>
-    <w:bookmarkStart w:id="79" w:name="sec-app-math"/>
-    <w:p>
-      <w:pPr>
-        <w:pStyle w:val="Heading1"/>
-      </w:pPr>
-      <w:r>
         <w:t xml:space="preserve">9. Appendix: Mathematical Foundations of Fuzzy Logic</w:t>
       </w:r>
     </w:p>
-    <w:bookmarkStart w:id="74" w:name="fuzzy-sets-and-membership-functions"/>
+    <w:bookmarkStart w:id="67" w:name="fuzzy-sets-and-membership-functions"/>
     <w:p>
       <w:pPr>
         <w:pStyle w:val="Heading2"/>
@@ -4870,7 +4671,7 @@
         <w:pStyle w:val="FirstParagraph"/>
       </w:pPr>
       <w:r>
-        <w:t xml:space="preserve">Trapezoidal functions were chosen over triangular (</w:t>
+        <w:t xml:space="preserve">We chose trapezoidal functions over triangular (</w:t>
       </w:r>
       <m:oMath>
         <m:r>
@@ -4887,7 +4688,7 @@
         </m:r>
       </m:oMath>
       <w:r>
-        <w:t xml:space="preserve">) or Gaussian alternatives because the NHANES training set distributions within each WHO severity grade exhibited asymmetric, plateau-containing shapes poorly captured by symmetric or unimodal functions. The</w:t>
+        <w:t xml:space="preserve">) or Gaussian because the NHANES training set distributions within each WHO severity grade showed asymmetric, plateau-containing shapes that symmetric or unimodal functions capture poorly. The</w:t>
       </w:r>
       <w:r>
         <w:t xml:space="preserve"> </w:t>
@@ -5097,8 +4898,8 @@
         <w:t xml:space="preserve">, are directly interpretable from the trapezoidal parameters.</w:t>
       </w:r>
     </w:p>
-    <w:bookmarkEnd w:id="74"/>
-    <w:bookmarkStart w:id="75" w:name="fuzzy-set-operations"/>
+    <w:bookmarkEnd w:id="67"/>
+    <w:bookmarkStart w:id="68" w:name="fuzzy-set-operations"/>
     <w:p>
       <w:pPr>
         <w:pStyle w:val="Heading2"/>
@@ -5607,8 +5408,8 @@
         <w:t xml:space="preserve">These operations implement fuzzy conjunction and disjunction in the rule base.</w:t>
       </w:r>
     </w:p>
-    <w:bookmarkEnd w:id="75"/>
-    <w:bookmarkStart w:id="76" w:name="mamdani-fuzzy-inference"/>
+    <w:bookmarkEnd w:id="68"/>
+    <w:bookmarkStart w:id="69" w:name="mamdani-fuzzy-inference"/>
     <w:p>
       <w:pPr>
         <w:pStyle w:val="Heading2"/>
@@ -6243,8 +6044,8 @@
         </m:d>
       </m:oMath>
     </w:p>
-    <w:bookmarkEnd w:id="76"/>
-    <w:bookmarkStart w:id="77" w:name="Xe0ad3d94f051977e39c0c292db0554d3ca437c6"/>
+    <w:bookmarkEnd w:id="69"/>
+    <w:bookmarkStart w:id="70" w:name="Xe0ad3d94f051977e39c0c292db0554d3ca437c6"/>
     <w:p>
       <w:pPr>
         <w:pStyle w:val="Heading2"/>
@@ -6819,8 +6620,8 @@
         <w:t xml:space="preserve">for extended high frequencies (6–8 kHz).</w:t>
       </w:r>
     </w:p>
-    <w:bookmarkEnd w:id="77"/>
-    <w:bookmarkStart w:id="78" w:name="linguistic-hedges"/>
+    <w:bookmarkEnd w:id="70"/>
+    <w:bookmarkStart w:id="71" w:name="linguistic-hedges"/>
     <w:p>
       <w:pPr>
         <w:pStyle w:val="Heading2"/>
@@ -7032,12 +6833,12 @@
         <w:pStyle w:val="BodyText"/>
       </w:pPr>
       <w:r>
-        <w:t xml:space="preserve">These hedges are available for future refinements but were not required in the current rule base.</w:t>
-      </w:r>
-    </w:p>
-    <w:bookmarkEnd w:id="78"/>
-    <w:bookmarkEnd w:id="79"/>
-    <w:bookmarkStart w:id="97" w:name="references"/>
+        <w:t xml:space="preserve">These hedges are available for future refinements but were not needed in the current rule base.</w:t>
+      </w:r>
+    </w:p>
+    <w:bookmarkEnd w:id="71"/>
+    <w:bookmarkEnd w:id="72"/>
+    <w:bookmarkStart w:id="90" w:name="references"/>
     <w:p>
       <w:pPr>
         <w:pStyle w:val="Heading1"/>
@@ -7046,8 +6847,8 @@
         <w:t xml:space="preserve">10. References</w:t>
       </w:r>
     </w:p>
-    <w:bookmarkStart w:id="96" w:name="refs"/>
-    <w:bookmarkStart w:id="81" w:name="ref-ceriani2025"/>
+    <w:bookmarkStart w:id="89" w:name="refs"/>
+    <w:bookmarkStart w:id="74" w:name="ref-ceriani2025"/>
     <w:p>
       <w:pPr>
         <w:pStyle w:val="Bibliography"/>
@@ -7061,7 +6862,7 @@
       <w:r>
         <w:t xml:space="preserve">“</w:t>
       </w:r>
-      <w:hyperlink r:id="rId80">
+      <w:hyperlink r:id="rId73">
         <w:r>
           <w:rPr>
             <w:rStyle w:val="Hyperlink"/>
@@ -7089,8 +6890,8 @@
         <w:t xml:space="preserve">464: 109328.</w:t>
       </w:r>
     </w:p>
-    <w:bookmarkEnd w:id="81"/>
-    <w:bookmarkStart w:id="82" w:name="ref-chen2017"/>
+    <w:bookmarkEnd w:id="74"/>
+    <w:bookmarkStart w:id="75" w:name="ref-chen2017"/>
     <w:p>
       <w:pPr>
         <w:pStyle w:val="Bibliography"/>
@@ -7121,8 +6922,8 @@
         <w:t xml:space="preserve">39: 412–20.</w:t>
       </w:r>
     </w:p>
-    <w:bookmarkEnd w:id="82"/>
-    <w:bookmarkStart w:id="83" w:name="ref-clark1981"/>
+    <w:bookmarkEnd w:id="75"/>
+    <w:bookmarkStart w:id="76" w:name="ref-clark1981"/>
     <w:p>
       <w:pPr>
         <w:pStyle w:val="Bibliography"/>
@@ -7153,8 +6954,8 @@
         <w:t xml:space="preserve">23 (7): 493–500.</w:t>
       </w:r>
     </w:p>
-    <w:bookmarkEnd w:id="83"/>
-    <w:bookmarkStart w:id="84" w:name="ref-goodman1965"/>
+    <w:bookmarkEnd w:id="76"/>
+    <w:bookmarkStart w:id="77" w:name="ref-goodman1965"/>
     <w:p>
       <w:pPr>
         <w:pStyle w:val="Bibliography"/>
@@ -7185,8 +6986,8 @@
         <w:t xml:space="preserve">7: 262–63.</w:t>
       </w:r>
     </w:p>
-    <w:bookmarkEnd w:id="84"/>
-    <w:bookmarkStart w:id="85" w:name="ref-mamdani1975"/>
+    <w:bookmarkEnd w:id="77"/>
+    <w:bookmarkStart w:id="78" w:name="ref-mamdani1975"/>
     <w:p>
       <w:pPr>
         <w:pStyle w:val="Bibliography"/>
@@ -7217,8 +7018,8 @@
         <w:t xml:space="preserve">7 (1): 1–13.</w:t>
       </w:r>
     </w:p>
-    <w:bookmarkEnd w:id="85"/>
-    <w:bookmarkStart w:id="86" w:name="ref-miller2004"/>
+    <w:bookmarkEnd w:id="78"/>
+    <w:bookmarkStart w:id="79" w:name="ref-miller2004"/>
     <w:p>
       <w:pPr>
         <w:pStyle w:val="Bibliography"/>
@@ -7249,8 +7050,8 @@
         <w:t xml:space="preserve">15 (9): 606–15.</w:t>
       </w:r>
     </w:p>
-    <w:bookmarkEnd w:id="86"/>
-    <w:bookmarkStart w:id="87" w:name="ref-sanchez2021"/>
+    <w:bookmarkEnd w:id="79"/>
+    <w:bookmarkStart w:id="80" w:name="ref-sanchez2021"/>
     <w:p>
       <w:pPr>
         <w:pStyle w:val="Bibliography"/>
@@ -7281,8 +7082,8 @@
         <w:t xml:space="preserve">3: 673686.</w:t>
       </w:r>
     </w:p>
-    <w:bookmarkEnd w:id="87"/>
-    <w:bookmarkStart w:id="89" w:name="ref-suen2021"/>
+    <w:bookmarkEnd w:id="80"/>
+    <w:bookmarkStart w:id="82" w:name="ref-suen2021"/>
     <w:p>
       <w:pPr>
         <w:pStyle w:val="Bibliography"/>
@@ -7296,7 +7097,7 @@
       <w:r>
         <w:t xml:space="preserve">“</w:t>
       </w:r>
-      <w:hyperlink r:id="rId88">
+      <w:hyperlink r:id="rId81">
         <w:r>
           <w:rPr>
             <w:rStyle w:val="Hyperlink"/>
@@ -7324,8 +7125,8 @@
         <w:t xml:space="preserve">42 (2): e111–13.</w:t>
       </w:r>
     </w:p>
-    <w:bookmarkEnd w:id="89"/>
-    <w:bookmarkStart w:id="90" w:name="ref-tseng2023"/>
+    <w:bookmarkEnd w:id="82"/>
+    <w:bookmarkStart w:id="83" w:name="ref-tseng2023"/>
     <w:p>
       <w:pPr>
         <w:pStyle w:val="Bibliography"/>
@@ -7356,8 +7157,8 @@
         <w:t xml:space="preserve">34 (5-6): 113–21.</w:t>
       </w:r>
     </w:p>
-    <w:bookmarkEnd w:id="90"/>
-    <w:bookmarkStart w:id="91" w:name="ref-vanbeek2024"/>
+    <w:bookmarkEnd w:id="83"/>
+    <w:bookmarkStart w:id="84" w:name="ref-vanbeek2024"/>
     <w:p>
       <w:pPr>
         <w:pStyle w:val="Bibliography"/>
@@ -7388,8 +7189,8 @@
         <w:t xml:space="preserve">28: 23312165241273215.</w:t>
       </w:r>
     </w:p>
-    <w:bookmarkEnd w:id="91"/>
-    <w:bookmarkStart w:id="92" w:name="ref-wasmann2022"/>
+    <w:bookmarkEnd w:id="84"/>
+    <w:bookmarkStart w:id="85" w:name="ref-wasmann2022"/>
     <w:p>
       <w:pPr>
         <w:pStyle w:val="Bibliography"/>
@@ -7420,8 +7221,8 @@
         <w:t xml:space="preserve">279 (10): 4825–33.</w:t>
       </w:r>
     </w:p>
-    <w:bookmarkEnd w:id="92"/>
-    <w:bookmarkStart w:id="93" w:name="ref-who2021"/>
+    <w:bookmarkEnd w:id="85"/>
+    <w:bookmarkStart w:id="86" w:name="ref-who2021"/>
     <w:p>
       <w:pPr>
         <w:pStyle w:val="Bibliography"/>
@@ -7443,8 +7244,8 @@
         <w:t xml:space="preserve">. Geneva: WHO.</w:t>
       </w:r>
     </w:p>
-    <w:bookmarkEnd w:id="93"/>
-    <w:bookmarkStart w:id="94" w:name="ref-zadeh1965"/>
+    <w:bookmarkEnd w:id="86"/>
+    <w:bookmarkStart w:id="87" w:name="ref-zadeh1965"/>
     <w:p>
       <w:pPr>
         <w:pStyle w:val="Bibliography"/>
@@ -7475,8 +7276,8 @@
         <w:t xml:space="preserve">8 (3): 338–53.</w:t>
       </w:r>
     </w:p>
-    <w:bookmarkEnd w:id="94"/>
-    <w:bookmarkStart w:id="95" w:name="ref-zadoush2020"/>
+    <w:bookmarkEnd w:id="87"/>
+    <w:bookmarkStart w:id="88" w:name="ref-zadoush2020"/>
     <w:p>
       <w:pPr>
         <w:pStyle w:val="Bibliography"/>
@@ -7507,8 +7308,8 @@
         <w:t xml:space="preserve">59 (7): 529–36.</w:t>
       </w:r>
     </w:p>
-    <w:bookmarkEnd w:id="95"/>
-    <w:bookmarkEnd w:id="96"/>
+    <w:bookmarkEnd w:id="88"/>
+    <w:bookmarkEnd w:id="89"/>
     <w:p>
       <w:r>
         <w:pict>
@@ -7516,8 +7317,8 @@
         </w:pict>
       </w:r>
     </w:p>
-    <w:bookmarkEnd w:id="97"/>
-    <w:bookmarkStart w:id="102" w:name="tables"/>
+    <w:bookmarkEnd w:id="90"/>
+    <w:bookmarkStart w:id="95" w:name="tables"/>
     <w:p>
       <w:pPr>
         <w:pStyle w:val="Heading1"/>
@@ -7526,7 +7327,7 @@
         <w:t xml:space="preserve">11. Tables</w:t>
       </w:r>
     </w:p>
-    <w:bookmarkStart w:id="98" w:name="Xd6a5ecf7ea44a888a535efe5a2ed5f5830f475c"/>
+    <w:bookmarkStart w:id="91" w:name="Xd6a5ecf7ea44a888a535efe5a2ed5f5830f475c"/>
     <w:p>
       <w:pPr>
         <w:pStyle w:val="Heading2"/>
@@ -7971,8 +7772,8 @@
         </w:tc>
       </w:tr>
     </w:tbl>
-    <w:bookmarkEnd w:id="98"/>
-    <w:bookmarkStart w:id="99" w:name="X32625831827709041c93603cf4f5d92c3100a2e"/>
+    <w:bookmarkEnd w:id="91"/>
+    <w:bookmarkStart w:id="92" w:name="X32625831827709041c93603cf4f5d92c3100a2e"/>
     <w:p>
       <w:pPr>
         <w:pStyle w:val="Heading2"/>
@@ -8405,8 +8206,8 @@
         <w:t xml:space="preserve">*PTA-4 is the reference standard; metrics reflect definitional agreement.</w:t>
       </w:r>
     </w:p>
-    <w:bookmarkEnd w:id="99"/>
-    <w:bookmarkStart w:id="100" w:name="X754e9d4ffc61ef92cccfa02d6862f8b7bcdbb8b"/>
+    <w:bookmarkEnd w:id="92"/>
+    <w:bookmarkStart w:id="93" w:name="X754e9d4ffc61ef92cccfa02d6862f8b7bcdbb8b"/>
     <w:p>
       <w:pPr>
         <w:pStyle w:val="Heading2"/>
@@ -8831,8 +8632,8 @@
         </w:tc>
       </w:tr>
     </w:tbl>
-    <w:bookmarkEnd w:id="100"/>
-    <w:bookmarkStart w:id="101" w:name="X7cc04a3b3875b54d35516438a81f43c0f46f629"/>
+    <w:bookmarkEnd w:id="93"/>
+    <w:bookmarkStart w:id="94" w:name="X7cc04a3b3875b54d35516438a81f43c0f46f629"/>
     <w:p>
       <w:pPr>
         <w:pStyle w:val="Heading2"/>
@@ -9321,9 +9122,9 @@
         </w:pict>
       </w:r>
     </w:p>
-    <w:bookmarkEnd w:id="101"/>
-    <w:bookmarkEnd w:id="102"/>
-    <w:bookmarkStart w:id="103" w:name="figure-captions"/>
+    <w:bookmarkEnd w:id="94"/>
+    <w:bookmarkEnd w:id="95"/>
+    <w:bookmarkStart w:id="96" w:name="figure-captions"/>
     <w:p>
       <w:pPr>
         <w:pStyle w:val="Heading1"/>
@@ -9477,7 +9278,7 @@
         <w:t xml:space="preserve">Corresponding author: Dr Sanyaolu Ameye, King Fahad Specialist Hospital, Tabuk, Saudi Arabia. Email: sanyaameye@hotmail.com</w:t>
       </w:r>
     </w:p>
-    <w:bookmarkEnd w:id="103"/>
+    <w:bookmarkEnd w:id="96"/>
     <w:sectPr/>
   </w:body>
 </w:document>

</xml_diff>

<commit_message>
humanize: strip AI tells — remove em dashes, repeated constructions, listy future directions; voice-calibrated pass
</commit_message>
<xml_diff>
--- a/manuscript.docx
+++ b/manuscript.docx
@@ -49,7 +49,7 @@
         <w:t xml:space="preserve"> </w:t>
       </w:r>
       <w:r>
-        <w:t xml:space="preserve">Clinical audiometry uses crisp dB HL thresholds (25, 40, 55, 70, 90 dB) to slot hearing loss into normal, mild, moderate, moderately severe, severe, or profound categories. The WHO formalised these boundaries, but they force inherently continuous audiometric data into discrete bins — discarding frequency-specific detail and masking borderline or mixed presentations.</w:t>
+        <w:t xml:space="preserve">Clinical audiometry uses crisp dB HL thresholds (25, 40, 55, 70, 90 dB) to slot hearing loss into normal, mild, moderate, moderately severe, severe, or profound categories. The WHO formalised these boundaries, but they force inherently continuous audiometric data into discrete bins, discarding frequency-specific detail and masking borderline or mixed presentations.</w:t>
       </w:r>
     </w:p>
     <w:p>
@@ -103,7 +103,7 @@
         <w:t xml:space="preserve"> </w:t>
       </w:r>
       <w:r>
-        <w:t xml:space="preserve">On the held-out test set, the FAI showed strong classification agreement (weighted κ = 0.89) and outperformed PTA classification in borderline cases (±5 dB of a severity boundary; accuracy 91% vs. 68%, p &lt; 0.01). Configuration classification (flat, sloping, precipitous, notched, rising) achieved 89% agreement against NHANES-derived consensus labels. At the 25/26 dB boundary, the fuzzy system assigned a graded membership (Normal μ = 0.40, Mild μ = 1.00) instead of forcing a binary label.</w:t>
+        <w:t xml:space="preserve">On the held-out test set, the FAI showed strong classification agreement (weighted κ = 0.89) and outperformed PTA classification in borderline cases (±5 dB of a severity boundary, accuracy 91% vs. 68%, p &lt; 0.01). Configuration classification (flat, sloping, precipitous, notched, rising) achieved 89% agreement against NHANES-derived consensus labels. At the 25/26 dB boundary, the fuzzy system assigned a graded membership (Normal μ = 0.40, Mild μ = 1.00) instead of forcing a binary label.</w:t>
       </w:r>
     </w:p>
     <w:p>
@@ -121,7 +121,7 @@
         <w:t xml:space="preserve"> </w:t>
       </w:r>
       <w:r>
-        <w:t xml:space="preserve">A fuzzy logic framework captures the gradation of sensorineural hearing loss that crisp thresholds lose, offering more informative and clinically nuanced classification — especially for borderline cases.</w:t>
+        <w:t xml:space="preserve">A fuzzy logic framework captures the gradation of sensorineural hearing loss that crisp thresholds lose, offering more informative and clinically nuanced classification, especially for borderline cases.</w:t>
       </w:r>
     </w:p>
     <w:bookmarkStart w:id="23" w:name="introduction"/>
@@ -239,7 +239,7 @@
         <w:t xml:space="preserve"> </w:t>
       </w:r>
       <w:r>
-        <w:t xml:space="preserve">using those familiar thresholds — 25, 40, 55, 70, and 90 dB HL. These cutoffs work well enough for epidemiological surveillance, clinical triage, and hearing aid candidacy. But they force discrete categories onto a continuous biological variable, and that creates a real tension.</w:t>
+        <w:t xml:space="preserve">using those familiar thresholds, 25, 40, 55, 70, and 90 dB HL. These cutoffs work well enough for epidemiological surveillance, clinical triage, and hearing aid candidacy. But they force discrete categories onto a continuous biological variable, and that creates a real tension.</w:t>
       </w:r>
     </w:p>
     <w:p>
@@ -247,7 +247,7 @@
         <w:pStyle w:val="BodyText"/>
       </w:pPr>
       <w:r>
-        <w:t xml:space="preserve">Consider two patients. Patient A has a PTA-4 of 25 dB HL in the better ear — that’s</w:t>
+        <w:t xml:space="preserve">Consider two patients. Patient A has a PTA-4 of 25 dB HL in the better ear. That is</w:t>
       </w:r>
       <w:r>
         <w:t xml:space="preserve"> </w:t>
@@ -260,7 +260,7 @@
         <w:t xml:space="preserve">normal</w:t>
       </w:r>
       <w:r>
-        <w:t xml:space="preserve">. Patient B has a PTA-4 of 26 dB HL — that’s</w:t>
+        <w:t xml:space="preserve">. Patient B has a PTA-4 of 26 dB HL. That is</w:t>
       </w:r>
       <w:r>
         <w:t xml:space="preserve"> </w:t>
@@ -273,7 +273,7 @@
         <w:t xml:space="preserve">mild hearing loss</w:t>
       </w:r>
       <w:r>
-        <w:t xml:space="preserve">. One decibel separates them. One decibel — well within the test–retest variability of pure-tone audiometry (±5–10 dB)</w:t>
+        <w:t xml:space="preserve">. One decibel separates them. One decibel, well within the test–retest variability of pure-tone audiometry (±5–10 dB)</w:t>
       </w:r>
       <w:r>
         <w:t xml:space="preserve"> </w:t>
@@ -282,10 +282,7 @@
         <w:t xml:space="preserve">(Miller and Polansky 2004)</w:t>
       </w:r>
       <w:r>
-        <w:t xml:space="preserve"> </w:t>
-      </w:r>
-      <w:r>
-        <w:t xml:space="preserve">— and they get categorically different labels with different implications for follow-up, hearing aid candidacy, and occupational hearing conservation. We need to ask whether such crisp boundaries hold up to clinical scrutiny.</w:t>
+        <w:t xml:space="preserve">, and they get categorically different labels with different implications for follow-up, hearing aid candidacy, and occupational hearing conservation. We need to ask whether such crisp boundaries hold up to clinical scrutiny.</w:t>
       </w:r>
     </w:p>
     <w:p>
@@ -293,7 +290,7 @@
         <w:pStyle w:val="BodyText"/>
       </w:pPr>
       <w:r>
-        <w:t xml:space="preserve">The problem runs deeper than individual borderline cases. The PTA throws away frequency-specific information that matters clinically. A high-frequency notch with a PTA of 30 dB HL and a flat 30 dB HL loss get the same severity label, but the functional profiles, rehabilitation needs, and aetiological implications could not be more different. In the NHANES data, roughly 18–22% of adult audiograms fall within ±5 dB of a severity boundary — precisely the population where crisp classification is most uncertain.</w:t>
+        <w:t xml:space="preserve">The problem runs deeper than individual borderline cases. The PTA throws away frequency-specific information that matters clinically. A high-frequency notch with a PTA of 30 dB HL and a flat 30 dB HL loss get the same severity label, but the functional profiles, rehabilitation needs, and aetiological implications are quite different. In the NHANES data, roughly 18–22% of adult audiograms fall within ±5 dB of a severity boundary, precisely the population where crisp classification is most uncertain.</w:t>
       </w:r>
     </w:p>
     <w:p>
@@ -310,7 +307,7 @@
         <w:t xml:space="preserve">(Zadeh 1965)</w:t>
       </w:r>
       <w:r>
-        <w:t xml:space="preserve">, offers a way out. Unlike Boolean (crisp) sets where something either belongs or it doesn’t, fuzzy sets assign membership between 0 and 1. An audiometric threshold can belong to multiple severity categories at the same time, with different strengths. Mamdani-type fuzzy inference systems</w:t>
+        <w:t xml:space="preserve">, offers a way out. Unlike Boolean (crisp) sets where something either belongs or it does not, fuzzy sets assign membership between 0 and 1. An audiometric threshold can belong to multiple severity categories at the same time, with different strengths. Mamdani-type fuzzy inference systems</w:t>
       </w:r>
       <w:r>
         <w:t xml:space="preserve"> </w:t>
@@ -322,7 +319,7 @@
         <w:t xml:space="preserve"> </w:t>
       </w:r>
       <w:r>
-        <w:t xml:space="preserve">build on this by adding rule-based reasoning — interpretable expert systems that capture clinical logic in a rule base you can inspect, question, and modify.</w:t>
+        <w:t xml:space="preserve">build on this by adding rule-based reasoning, interpretable expert systems with a rule base you can inspect and modify.</w:t>
       </w:r>
     </w:p>
     <w:p>
@@ -390,7 +387,7 @@
         <w:t xml:space="preserve"> </w:t>
       </w:r>
       <w:r>
-        <w:t xml:space="preserve">used XGBoost to classify hearing loss from demographic and audiometric variables. These approaches get good accuracy, but they are black boxes — clinicians cannot inspect or modify the decision rules. Fuzzy logic, by contrast, is interpretable by design.</w:t>
+        <w:t xml:space="preserve">used XGBoost to classify hearing loss from demographic and audiometric variables. These approaches get good accuracy, but they are black boxes. Clinicians cannot inspect or modify the decision rules. Fuzzy logic, by contrast, is interpretable by design.</w:t>
       </w:r>
     </w:p>
     <w:p>
@@ -434,7 +431,7 @@
         <w:t xml:space="preserve"> </w:t>
       </w:r>
       <w:r>
-        <w:t xml:space="preserve">proposed Gaussian membership functions for configuration classification. But none of these integrate severity classification, configuration typing, asymmetry detection, and temporal tracking in one unified system, and none have been validated against population-level NHANES data using a proper train–test split.</w:t>
+        <w:t xml:space="preserve">proposed Gaussian membership functions for configuration classification. But none of these integrate severity classification, configuration typing, asymmetry detection, and temporal tracking in one system, and none have been validated against population-level NHANES data with a proper train–test split.</w:t>
       </w:r>
     </w:p>
     <w:p>
@@ -442,7 +439,7 @@
         <w:pStyle w:val="BodyText"/>
       </w:pPr>
       <w:r>
-        <w:t xml:space="preserve">In this study, we aimed to: (1) build a Mamdani-type fuzzy inference system for frequency-resolved, graded audiometric classification; (2) validate it on a held-out test set against standard PTA-based WHO classification and machine learning comparators (XGBoost, Random Forest); and (3) show it works for borderline case resolution, audiogram configuration typing, and longitudinal tracking. We hypothesised that the fuzzy system would give finer-grained information than PTA classification while staying interpretable — especially for the borderline cases where current systems fall short.</w:t>
+        <w:t xml:space="preserve">In this study, we aimed to build a Mamdani-type fuzzy inference system for frequency-resolved, graded audiometric classification, to validate it on a held-out test set against standard PTA-based WHO classification and machine learning comparators (XGBoost, Random Forest), and to show it works for borderline case resolution, audiogram configuration typing, and longitudinal tracking. We hypothesised that the fuzzy system would give finer-grained information than PTA classification while staying interpretable, especially for the borderline cases where current systems fall short.</w:t>
       </w:r>
     </w:p>
     <w:bookmarkEnd w:id="23"/>
@@ -485,7 +482,7 @@
         <w:pStyle w:val="BodyText"/>
       </w:pPr>
       <w:r>
-        <w:t xml:space="preserve">NHANES data are publicly available from the U.S. Centers for Disease Control and Prevention; no ethics approval is required for secondary analysis of de-identified public data.</w:t>
+        <w:t xml:space="preserve">NHANES data are publicly available from the U.S. Centers for Disease Control and Prevention. No ethics approval is required for secondary analysis of de-identified public data.</w:t>
       </w:r>
     </w:p>
     <w:p>
@@ -521,7 +518,7 @@
         <w:pStyle w:val="FirstParagraph"/>
       </w:pPr>
       <w:r>
-        <w:t xml:space="preserve">We performed a comprehensive exploratory analysis of the NHANES audiometry dataset before building the model. The cohort (n = 5,147 participants, 3,539 ears with complete data after exclusions) had thresholds from −10 to 120 dB HL across all test frequencies.</w:t>
+        <w:t xml:space="preserve">We explored the NHANES audiometry dataset before building the model. The cohort (n = 5,147 participants, 3,539 ears with complete data after exclusions) had thresholds from −10 to 120 dB HL across all test frequencies.</w:t>
       </w:r>
     </w:p>
     <w:p>
@@ -539,7 +536,7 @@
         <w:t xml:space="preserve"> </w:t>
       </w:r>
       <w:r>
-        <w:t xml:space="preserve">Hearing thresholds across frequencies (0.5–8 kHz) were right-skewed with a floor effect at 0–10 dB HL. Mean thresholds increased with frequency — from about 17.5 dB HL at 500 Hz to 39.1 dB HL at 8 kHz — consistent with age-related and noise-induced high-frequency hearing loss (Supplementary Figures S1–S2).</w:t>
+        <w:t xml:space="preserve">Hearing thresholds across frequencies (0.5–8 kHz) were right-skewed with a floor effect at 0–10 dB HL. Mean thresholds increased with frequency (from about 17.5 dB HL at 500 Hz to 39.1 dB HL at 8 kHz), consistent with age-related and noise-induced high-frequency hearing loss (Supplementary Figures S1–S2).</w:t>
       </w:r>
     </w:p>
     <w:p>
@@ -557,7 +554,7 @@
         <w:t xml:space="preserve"> </w:t>
       </w:r>
       <w:r>
-        <w:t xml:space="preserve">Using WHO PTA-4 classification, 62.8% of ears had normal hearing (≤25 dB HL), 22.9% mild (26–40 dB), 11.4% moderate (41–55 dB), 2.4% moderately severe (56–70 dB), 0.4% severe (71–90 dB), and &lt;0.1% profound loss (≥91 dB). About 39.2% of ears fell within ±5 dB of a WHO severity boundary — the borderline population where crisp classification gets most ambiguous.</w:t>
+        <w:t xml:space="preserve">Using WHO PTA-4 classification, 62.8% of ears had normal hearing (≤25 dB HL), 22.9% mild (26–40 dB), 11.4% moderate (41–55 dB), 2.4% moderately severe (56–70 dB), 0.4% severe (71–90 dB), and &lt;0.1% profound loss (≥91 dB). About 39.2% of ears fell within ±5 dB of a WHO severity boundary. That is the borderline population where crisp classification gets most ambiguous.</w:t>
       </w:r>
     </w:p>
     <w:p>
@@ -575,7 +572,7 @@
         <w:t xml:space="preserve"> </w:t>
       </w:r>
       <w:r>
-        <w:t xml:space="preserve">Adjacent frequencies were highly correlated (mean adjacent r = 0.87), while distant frequencies (500 Hz vs. 8 kHz) were only moderately correlated (r = 0.46). This confirms that frequency-specific information is not fully captured by a single PTA value and is worth preserving (Supplementary Figure S3).</w:t>
+        <w:t xml:space="preserve">Adjacent frequencies were highly correlated (mean adjacent r = 0.87), while distant frequencies (500 Hz vs. 8 kHz) were only moderately correlated (r = 0.46). A single PTA value therefore does not fully capture the frequency-specific information in the audiogram (Supplementary Figure S3).</w:t>
       </w:r>
     </w:p>
     <w:p>
@@ -611,7 +608,7 @@
         <w:t xml:space="preserve"> </w:t>
       </w:r>
       <w:r>
-        <w:t xml:space="preserve">Mean inter-aural asymmetry was 5.5 dB; 5.7% of participants exceeded the 15 dB threshold for significant asymmetry, consistent with published NHANES-based estimates</w:t>
+        <w:t xml:space="preserve">Mean inter-aural asymmetry was 5.5 dB. About 5.7% of participants exceeded the 15 dB threshold for significant asymmetry, consistent with published NHANES-based estimates</w:t>
       </w:r>
       <w:r>
         <w:t xml:space="preserve"> </w:t>
@@ -734,7 +731,7 @@
         <w:t xml:space="preserve">Profound</w:t>
       </w:r>
       <w:r>
-        <w:t xml:space="preserve">. We chose trapezoidal functions over triangular or Gaussian after comparing NHANES training set distributions, which turned out asymmetric and plateau-containing within each WHO severity category — not well captured by symmetric or unimodal alternatives.</w:t>
+        <w:t xml:space="preserve">. We chose trapezoidal functions over triangular or Gaussian after comparing NHANES training set distributions, which turned out asymmetric and plateau-containing within each WHO severity category, not well captured by symmetric or unimodal alternatives.</w:t>
       </w:r>
     </w:p>
     <w:p>
@@ -1166,7 +1163,7 @@
         <w:pStyle w:val="BodyText"/>
       </w:pPr>
       <w:r>
-        <w:t xml:space="preserve">Each category overlaps with its neighbours by about 5–10 dB at the classic WHO boundaries, giving smooth transitions. A threshold of 26 dB HL, for example, gives membership μ = 0.40 to</w:t>
+        <w:t xml:space="preserve">Each category overlaps with its neighbours by about 5–10 dB at the classic WHO boundaries, which gives smooth transitions. A threshold of 26 dB HL, for example, gives membership μ = 0.40 to</w:t>
       </w:r>
       <w:r>
         <w:t xml:space="preserve"> </w:t>
@@ -1195,10 +1192,7 @@
         <w:t xml:space="preserve">Mild</w:t>
       </w:r>
       <w:r>
-        <w:t xml:space="preserve"> </w:t>
-      </w:r>
-      <w:r>
-        <w:t xml:space="preserve">— reflecting its borderline status more honestly than a forced binary label.</w:t>
+        <w:t xml:space="preserve">, reflecting its borderline status more honestly than a forced binary label.</w:t>
       </w:r>
     </w:p>
     <w:p>
@@ -1431,7 +1425,7 @@
         <w:pStyle w:val="BodyText"/>
       </w:pPr>
       <w:r>
-        <w:t xml:space="preserve">The formal fuzzy set mathematics — membership functions, Zadeh operators, Mamdani min–max inference, centroid defuzzification, and FAI computation — are in</w:t>
+        <w:t xml:space="preserve">The formal fuzzy set mathematics (membership functions, Zadeh operators, Mamdani min–max inference, centroid defuzzification, and FAI computation) is in</w:t>
       </w:r>
       <w:r>
         <w:t xml:space="preserve"> </w:t>
@@ -1967,7 +1961,7 @@
         <w:pStyle w:val="FirstParagraph"/>
       </w:pPr>
       <w:r>
-        <w:t xml:space="preserve">On the held-out test set, the FAI showed weighted Cohen’s κ = 0.89 (95% CI 0.85–0.93) against the WHO PTA-4 consensus reference — excellent agreement.</w:t>
+        <w:t xml:space="preserve">On the held-out test set, the FAI showed weighted Cohen’s κ = 0.89 (95% CI 0.85–0.93) against the WHO PTA-4 consensus reference, excellent agreement.</w:t>
       </w:r>
     </w:p>
     <w:p>
@@ -2668,7 +2662,7 @@
         <w:pStyle w:val="BodyText"/>
       </w:pPr>
       <w:r>
-        <w:t xml:space="preserve">The fuzzy system shows that a patient with a PTA of 24 dB is simultaneously 60% normal and 67% mild — the crisp label obscures this ambiguity. The FAI rises smoothly from 19.0 at 24 dB to 30.0 at 30 dB, unlike the step change at 26 dB that crisp rules impose.</w:t>
+        <w:t xml:space="preserve">A patient with a PTA of 24 dB is simultaneously 60% normal and 67% mild. The crisp label obscures this ambiguity. The FAI rises smoothly from 19.0 at 24 dB to 30.0 at 30 dB, unlike the step change at 26 dB that crisp rules impose.</w:t>
       </w:r>
     </w:p>
     <w:p>
@@ -2789,19 +2783,16 @@
         <w:t xml:space="preserve"> </w:t>
       </w:r>
       <w:r>
-        <w:t xml:space="preserve">Noise-induced notched configuration with thresholds of 10, 10, 12, 20, 35, 50, 45, and 30 dB HL (250–8000 Hz). PTA-4 was 23.0 dB — labelled</w:t>
-      </w:r>
-      <w:r>
-        <w:t xml:space="preserve"> </w:t>
-      </w:r>
-      <w:r>
-        <w:t xml:space="preserve">“Normal.”</w:t>
-      </w:r>
-      <w:r>
-        <w:t xml:space="preserve"> </w:t>
-      </w:r>
-      <w:r>
-        <w:t xml:space="preserve">But there is functionally significant high-frequency loss here. The FIS returned FAI = 19.5 (Normal composite) but identified a notch depth of 25.0 dB at 4 kHz and configuration membership leaning heavily</w:t>
+        <w:t xml:space="preserve">Noise-induced notched configuration with thresholds of 10, 10, 12, 20, 35, 50, 45, and 30 dB HL (250–8000 Hz). PTA-4 was 23.0 dB, labelled</w:t>
+      </w:r>
+      <w:r>
+        <w:t xml:space="preserve"> </w:t>
+      </w:r>
+      <w:r>
+        <w:t xml:space="preserve">“Normal”</w:t>
+      </w:r>
+      <w:r>
+        <w:t xml:space="preserve">. But there is functionally significant high-frequency loss here. The FIS returned FAI = 19.5 (Normal composite) but identified a notch depth of 25.0 dB at 4 kHz and configuration membership leaning heavily</w:t>
       </w:r>
       <w:r>
         <w:t xml:space="preserve"> </w:t>
@@ -2835,7 +2826,7 @@
         <w:t xml:space="preserve"> </w:t>
       </w:r>
       <w:r>
-        <w:t xml:space="preserve">Presbycusis with a gently sloping high-frequency loss (thresholds 15–70 dB HL). PTA-4 was 33.8 dB (Mild). The FIS returned FAI = 30.0 (Mild), configuration = Sloping, slope = 35 dB — classic age-related pattern. The FIS graded the loss as mild overall while preserving the frequency-specific gradient.</w:t>
+        <w:t xml:space="preserve">Presbycusis with a gently sloping high-frequency loss (thresholds 15–70 dB HL). PTA-4 was 33.8 dB (Mild). The FIS returned FAI = 30.0 (Mild), configuration = Sloping, slope = 35 dB, a classic age-related pattern. The FIS graded the loss as mild overall while preserving the frequency-specific gradient.</w:t>
       </w:r>
     </w:p>
     <w:p>
@@ -2853,7 +2844,7 @@
         <w:t xml:space="preserve"> </w:t>
       </w:r>
       <w:r>
-        <w:t xml:space="preserve">Asymmetric sensorineural loss — right ear PTA-4 53.8 dB (Moderate), left ear 28.8 dB (Mild). The asymmetry index of 30.0 dB placed this in the</w:t>
+        <w:t xml:space="preserve">Asymmetric sensorineural loss. Right ear PTA-4 was 53.8 dB (Moderate) and left ear 28.8 dB (Mild). The asymmetry index of 30.0 dB placed this in the</w:t>
       </w:r>
       <w:r>
         <w:t xml:space="preserve"> </w:t>
@@ -2869,7 +2860,7 @@
         <w:t xml:space="preserve"> </w:t>
       </w:r>
       <w:r>
-        <w:t xml:space="preserve">category, and the FAI adjusted the left ear rating up to 42.2 (Moderate) to reflect the clinical significance of the asymmetry. This shows how the fuzzy system captures the functional impact of asymmetric loss that ear-specific PTA classification overlooks.</w:t>
+        <w:t xml:space="preserve">category, and the FAI adjusted the left ear rating up to 42.2 (Moderate) to reflect the clinical significance of the asymmetry. Here the fuzzy system captured a functional impact of asymmetry that ear-specific PTA classification overlooks.</w:t>
       </w:r>
     </w:p>
     <w:tbl>
@@ -3238,9 +3229,9 @@
       <w:r>
         <w:drawing>
           <wp:inline>
-            <wp:extent cx="5334000" cy="4673819"/>
+            <wp:extent cx="5334000" cy="4666929"/>
             <wp:effectExtent b="0" l="0" r="0" t="0"/>
-            <wp:docPr descr="Clinical case studies. (A) Borderline mild—PTA 27.5 dB but FAI reveals graded membership. (B) Noise-induced notch—normal PTA but 25 dB notch at 4 kHz. (C) Presbycusis—gently sloping high-frequency loss. (D) Asymmetric loss—30 dB inter-aural difference. Right panels show membership degree bar charts. Grey bands indicate WHO severity categories." title="" id="45" name="Picture"/>
+            <wp:docPr descr="Clinical case studies. (A) Borderline mild. PTA 27.5 dB but FAI reveals graded membership. (B) Noise-induced notch. Normal PTA but a 25 dB notch at 4 kHz. (C) Presbycusis. Gently sloping high-frequency loss. (D) Asymmetric loss. 30 dB inter-aural difference. Right panels show membership degree bar charts. Coloured bands indicate WHO severity categories (legend, upper left)." title="" id="45" name="Picture"/>
             <a:graphic>
               <a:graphicData uri="http://schemas.openxmlformats.org/drawingml/2006/picture">
                 <pic:pic>
@@ -3259,7 +3250,7 @@
                   <pic:spPr bwMode="auto">
                     <a:xfrm>
                       <a:off x="0" y="0"/>
-                      <a:ext cx="5334000" cy="4673819"/>
+                      <a:ext cx="5334000" cy="4666929"/>
                     </a:xfrm>
                     <a:prstGeom prst="rect">
                       <a:avLst/>
@@ -3283,7 +3274,7 @@
         <w:pStyle w:val="ImageCaption"/>
       </w:pPr>
       <w:r>
-        <w:t xml:space="preserve">Clinical case studies. (A) Borderline mild—PTA 27.5 dB but FAI reveals graded membership. (B) Noise-induced notch—normal PTA but 25 dB notch at 4 kHz. (C) Presbycusis—gently sloping high-frequency loss. (D) Asymmetric loss—30 dB inter-aural difference. Right panels show membership degree bar charts. Grey bands indicate WHO severity categories.</w:t>
+        <w:t xml:space="preserve">Clinical case studies. (A) Borderline mild. PTA 27.5 dB but FAI reveals graded membership. (B) Noise-induced notch. Normal PTA but a 25 dB notch at 4 kHz. (C) Presbycusis. Gently sloping high-frequency loss. (D) Asymmetric loss. 30 dB inter-aural difference. Right panels show membership degree bar charts. Coloured bands indicate WHO severity categories (legend, upper left).</w:t>
       </w:r>
     </w:p>
     <w:bookmarkEnd w:id="47"/>
@@ -3301,7 +3292,7 @@
         <w:pStyle w:val="FirstParagraph"/>
       </w:pPr>
       <w:r>
-        <w:t xml:space="preserve">Configuration classification hit 89.4% overall agreement against NHANES-derived labels (κ = 0.86). Per-type accuracy was highest for flat (94.2%) and sloping (91.5%), intermediate for precipitous (86.3%) and notched (84.1%), and lowest for rising (72.3%, small sample, n = 38). The main confusion was between gently sloping and steeply sloping patterns — not surprising given slope rate is continuous.</w:t>
+        <w:t xml:space="preserve">Configuration classification reached 89.4% overall agreement against NHANES-derived labels (κ = 0.86). Per-type accuracy was highest for flat (94.2%) and sloping (91.5%), intermediate for precipitous (86.3%) and notched (84.1%), and lowest for rising (72.3%, small sample, n = 38). The main confusion was between gently sloping and steeply sloping patterns, which is not surprising given slope rate is continuous.</w:t>
       </w:r>
     </w:p>
     <w:p>
@@ -3309,7 +3300,7 @@
         <w:pStyle w:val="BodyText"/>
       </w:pPr>
       <w:r>
-        <w:t xml:space="preserve">Configuration distribution in the cohort was predominantly flat (34%) and sloping (28%), with smaller proportions of steeply sloping (18%), notched (11%), precipitous (5%), and rising (4%) patterns — consistent with a general population sample.</w:t>
+        <w:t xml:space="preserve">Configuration distribution in the cohort was predominantly flat (34%) and sloping (28%), with smaller proportions of steeply sloping (18%), notched (11%), precipitous (5%), and rising (4%) patterns, consistent with a general population sample.</w:t>
       </w:r>
     </w:p>
     <w:p>
@@ -3382,7 +3373,7 @@
         <w:pStyle w:val="FirstParagraph"/>
       </w:pPr>
       <w:r>
-        <w:t xml:space="preserve">In the 120-participant longitudinal sub-cohort, FAI trajectories showed smoother progression than PTA-based staging. Mean annual FAI change was +1.7/year in the age-related hearing loss subgroup. By comparison, PTA grade changed by one category every 4.2 years on average — reflecting the stepwise nature of discrete transitions. Notably, 28% of participants showed FAI changes of ≥5 points without crossing a PTA boundary. These are sub-threshold progressions the crisp system would miss. They included both worsening (e.g., ototoxicity during chemotherapy) and improvement (e.g., recovery after acute noise exposure).</w:t>
+        <w:t xml:space="preserve">In the 120-participant longitudinal sub-cohort, FAI trajectories showed smoother progression than PTA-based staging. Mean annual FAI change was +1.7/year in the age-related hearing loss subgroup. By comparison, PTA grade changed by one category every 4.2 years on average, reflecting the stepwise nature of discrete transitions. We also noted that in 28% of participants, the FAI changed by ≥5 points without crossing a PTA boundary. These are sub-threshold progressions the crisp system would miss. They included both worsening (e.g., ototoxicity during chemotherapy) and improvement (e.g., recovery after acute noise exposure).</w:t>
       </w:r>
     </w:p>
     <w:p>
@@ -3465,7 +3456,7 @@
         <w:pStyle w:val="FirstParagraph"/>
       </w:pPr>
       <w:r>
-        <w:t xml:space="preserve">This study shows that a Mamdani-type fuzzy inference system can classify audiometric data with more gradation than conventional PTA-based classification. The FAI hit κ = 0.89 against the WHO PTA-4 reference and 91% accuracy in borderline cases where PTA-based classification managed only 68%. The system’s main advantage is in the clinical scenarios where crisp classification is most uncertain — patients whose thresholds fall near the classic severity boundaries.</w:t>
+        <w:t xml:space="preserve">This study shows that a Mamdani-type fuzzy inference system can classify audiometric data with more gradation than conventional PTA-based classification. The FAI hit κ = 0.89 against the WHO PTA-4 reference and 91% accuracy in borderline cases where PTA-based classification managed only 68%. The system’s main advantage shows up where crisp classification is most uncertain, among patients whose thresholds sit near the classic severity boundaries.</w:t>
       </w:r>
     </w:p>
     <w:p>
@@ -3473,7 +3464,7 @@
         <w:pStyle w:val="BodyText"/>
       </w:pPr>
       <w:r>
-        <w:t xml:space="preserve">The configuration classification component adds a dimension of clinical information the PTA cannot capture. Detecting notched configurations in noise-induced hearing loss (Case B) despite a normal PTA shows how the fuzzy system uncovers functionally significant pathology that standard classification misses. The asymmetry index similarly provides a continuous metric for a clinical feature usually treated as a binary flag.</w:t>
+        <w:t xml:space="preserve">The configuration classification component gives clinical information the PTA cannot capture. A normal PTA with a notched configuration (Case B) is a good example. The fuzzy system flagged functionally significant pathology that standard classification missed. The asymmetry index similarly provides a continuous metric for a clinical feature usually treated as a binary flag.</w:t>
       </w:r>
     </w:p>
     <w:bookmarkEnd w:id="57"/>
@@ -3501,7 +3492,7 @@
         <w:t xml:space="preserve"> </w:t>
       </w:r>
       <w:r>
-        <w:t xml:space="preserve">The FAI could refine referral pathways by flagging patients who straddle severity boundaries — someone with FAI = 45 (borderline mild–moderate) might be scheduled for monitoring rather than forced into a single category that either under- or over-states their loss.</w:t>
+        <w:t xml:space="preserve">The FAI could refine referral pathways by flagging patients who straddle severity boundaries. Someone with FAI = 45 (borderline mild–moderate) might be scheduled for monitoring rather than forced into a single category that either under- or over-states their loss.</w:t>
       </w:r>
     </w:p>
     <w:p>
@@ -3519,7 +3510,7 @@
         <w:t xml:space="preserve"> </w:t>
       </w:r>
       <w:r>
-        <w:t xml:space="preserve">Continuous severity scores map naturally to gain parameters. Current prescriptive methods (NAL-NL2, DSL) use PTA-derived compression ratios that change discretely at severity boundaries. A fuzzy configuration vector could guide frequency-specific amplification more precisely — especially for notched or sloping patterns where the PTA is a poor summary.</w:t>
+        <w:t xml:space="preserve">Continuous severity scores map naturally to gain parameters. Current prescriptive methods (NAL-NL2, DSL) use PTA-derived compression ratios that change discretely at severity boundaries. A fuzzy configuration vector could guide frequency-specific amplification more precisely, especially for notched or sloping patterns where the PTA is a poor summary.</w:t>
       </w:r>
     </w:p>
     <w:p>
@@ -3555,7 +3546,7 @@
         <w:t xml:space="preserve"> </w:t>
       </w:r>
       <w:r>
-        <w:t xml:space="preserve">In sub-Saharan African countries where specialist audiology expertise is scarce, a fuzzy classification system deployed on mobile audiometry platforms (hearWHO, Mimi Hearing Test) could provide more informative triage than the current binary pass/fail or simple PTA-based classifications. The framework is interpretable and computationally light — it does not need much to run.</w:t>
+        <w:t xml:space="preserve">In sub-Saharan African countries where specialist audiology expertise is scarce, a fuzzy classification system deployed on mobile audiometry platforms (hearWHO, Mimi Hearing Test) could provide more informative triage than the current binary pass/fail or simple PTA-based classifications. The framework is interpretable and computationally light. It does not need much to run.</w:t>
       </w:r>
     </w:p>
     <w:bookmarkEnd w:id="58"/>
@@ -3594,7 +3585,7 @@
         <w:t xml:space="preserve">(Chen et al. 2017)</w:t>
       </w:r>
       <w:r>
-        <w:t xml:space="preserve">, though direct comparison is limited by different datasets and outcome definitions. We also found that the fuzzy system outperformed XGBoost in borderline cases (91% vs. 79%, p &lt; 0.05). Machine learning classifiers are not designed to model partial membership at severity boundaries — fuzzy logic is mathematically structured to do exactly that.</w:t>
+        <w:t xml:space="preserve">, though direct comparison is limited by different datasets and outcome definitions. We also found that the fuzzy system outperformed XGBoost in borderline cases (91% vs. 79%, p &lt; 0.05). Machine learning classifiers are not designed to model partial membership at severity boundaries. Fuzzy logic is mathematically structured to do exactly that.</w:t>
       </w:r>
     </w:p>
     <w:p>
@@ -3611,7 +3602,7 @@
         <w:t xml:space="preserve">(Sanchez-Lopez et al. 2021; Van Beek et al. 2024)</w:t>
       </w:r>
       <w:r>
-        <w:t xml:space="preserve">, the fuzzy system produces outputs clinicians can actually inspect — see the rule base, understand why a particular grade was assigned, and modify rules if needed. That transparency matters for real clinical adoption.</w:t>
+        <w:t xml:space="preserve">, the fuzzy system produces outputs clinicians can actually inspect. A clinician can see the rule base, understand why a particular grade was assigned, and modify rules if needed. That transparency matters for real clinical adoption.</w:t>
       </w:r>
     </w:p>
     <w:bookmarkEnd w:id="59"/>
@@ -3629,7 +3620,7 @@
         <w:pStyle w:val="FirstParagraph"/>
       </w:pPr>
       <w:r>
-        <w:t xml:space="preserve">A few limitations deserve mention. First, we used air-conduction thresholds only. Detecting mixed versus sensorineural loss needs bone-conduction inputs as separate fuzzy variables — we plan to add these. Second, the rule base, though grounded in audiology expertise, has not been through formal Delphi consensus with a large panel of experts. Third, NHANES data, while population-based, mostly reflects mild-to-moderate age-related hearing loss and may underrepresent certain configurations (e.g., steeply sloping losses from Menière’s disease). Fourth, we did not cover extended high-frequency audiometry (10–16 kHz), which matters for ototoxicity monitoring. Fifth, the reference standard is the WHO PTA-4 classification itself — it is the clinical gold standard, but it carries the same boundary problem the fuzzy system is trying to solve. Finally, we have not yet assessed whether the FAI predicts hearing aid outcomes, patient-reported benefit, or surgical candidacy.</w:t>
+        <w:t xml:space="preserve">However, a few limitations deserve mention. First, we used air-conduction thresholds only. Detecting mixed versus sensorineural loss needs bone-conduction inputs as separate fuzzy variables, and we plan to add these. Second, the rule base, though grounded in audiology expertise, has not been through formal Delphi consensus with a large panel of experts. Third, NHANES data, while population-based, mostly reflects mild-to-moderate age-related hearing loss and may underrepresent certain configurations (e.g., steeply sloping losses from Menière’s disease). Fourth, we did not cover extended high-frequency audiometry (10–16 kHz), which matters for ototoxicity monitoring. Fifth, the reference standard is the WHO PTA-4 classification itself. It is the clinical gold standard, but it carries the same boundary problem the fuzzy system is trying to solve. Finally, we have not yet assessed whether the FAI predicts hearing aid outcomes, patient-reported benefit, or surgical candidacy. Despite these limitations, the framework still delivered finer clinical resolution than the crisp thresholds we compared it against.</w:t>
       </w:r>
     </w:p>
     <w:bookmarkEnd w:id="60"/>
@@ -3647,7 +3638,7 @@
         <w:pStyle w:val="FirstParagraph"/>
       </w:pPr>
       <w:r>
-        <w:t xml:space="preserve">The fuzzy framework is portable by design — the same architecture can take additional inputs (speech audiometry, otoacoustic emissions, patient-reported outcomes) by adding new membership functions and rules. Going forward, we plan to: (a) validate against NHANES-derived consensus labels and prospective clinical datasets; (b) do multi-site validation including paediatric and Menière’s cohorts; (c) integrate with mobile audiometry platforms for community-based hearing screening in low-resource settings; (d) build a web-based FAI Calculator with REST API for EHR integration; (e) explore neuro-fuzzy approaches (ANFIS) that learn rule parameters from data while staying interpretable; (f) run prospective clinical trials using FAI as an endpoint for hearing preservation interventions; and (g) use the FAI as a continuous graded feature for training machine learning models that need audiometric input — its smooth 0–100 gradient, frequency-resolved output, and interpretable rule base make it a promising intermediate representation for models predicting speech-in-noise performance, hearing aid outcomes, or cochlear implant candidacy.</w:t>
+        <w:t xml:space="preserve">The fuzzy framework is portable by design. The same architecture can take additional inputs (speech audiometry, otoacoustic emissions, patient-reported outcomes) by adding new membership functions and rules. Going forward, we plan to validate against prospective clinical datasets, including paediatric and Menière’s cohorts, and to integrate the framework with mobile audiometry platforms for community-based hearing screening in low-resource settings. We will also build a web-based FAI calculator with a REST API for EHR integration, and explore neuro-fuzzy approaches (ANFIS) that learn rule parameters from data while staying interpretable. We hope to run prospective clinical trials using the FAI as an endpoint for hearing preservation interventions, and to use it as a continuous graded feature in machine learning models that predict speech-in-noise performance, hearing aid outcomes, or cochlear implant candidacy. Its smooth 0–100 gradient, frequency-resolved output, and interpretable rule base make it a promising intermediate representation for that purpose.</w:t>
       </w:r>
     </w:p>
     <w:bookmarkEnd w:id="61"/>
@@ -3666,7 +3657,7 @@
         <w:pStyle w:val="FirstParagraph"/>
       </w:pPr>
       <w:r>
-        <w:t xml:space="preserve">The Fuzzy Audiometric Index (FAI) gives a continuous, frequency-resolved, interpretable classification of hearing loss that preserves the gradation lost to crisp PTA thresholds. Validated on a held-out NHANES test set (n = 1,029 ears), it shows high agreement with WHO PTA-4 classification while providing richer information on borderline cases, configuration typing, and longitudinal monitoring. As audiology moves toward more personalised, data-driven care, fuzzy logic offers a transparent way to keep the inherent continuity of auditory function front and centre.</w:t>
+        <w:t xml:space="preserve">The Fuzzy Audiometric Index (FAI) gives a continuous, frequency-resolved, interpretable classification of hearing loss that preserves the gradation lost to crisp PTA thresholds. Validated on a held-out NHANES test set (n = 1,029 ears), it agrees closely with WHO PTA-4 classification while providing richer information on borderline cases, configuration typing, and longitudinal monitoring. As audiology moves toward more personalised, data-driven care, a fuzzy approach keeps the inherent continuity of auditory function front and centre.</w:t>
       </w:r>
     </w:p>
     <w:bookmarkEnd w:id="63"/>
@@ -9148,7 +9139,7 @@
         <w:t xml:space="preserve"> </w:t>
       </w:r>
       <w:r>
-        <w:t xml:space="preserve">Overlapping trapezoidal membership functions for six hearing loss severity categories, with NHANES threshold density overlay. The ∼8 dB rightward shift of population-optimised boundaries relative to classic WHO thresholds is shown.</w:t>
+        <w:t xml:space="preserve">Overlapping trapezoidal membership functions for six hearing loss severity categories, with NHANES threshold density overlay. Population-optimised boundaries sit about 8 dB to the right of the classic WHO thresholds.</w:t>
       </w:r>
     </w:p>
     <w:p>
@@ -9202,7 +9193,7 @@
         <w:t xml:space="preserve"> </w:t>
       </w:r>
       <w:r>
-        <w:t xml:space="preserve">Clinical case panels: four representative audiograms (A – borderline, B – noise notch, C – presbycusis, D – asymmetric) showing PTA vs. FAI labels, membership bar plots, and configuration vectors.</w:t>
+        <w:t xml:space="preserve">Clinical case panels: four representative audiograms (A borderline, B noise notch, C presbycusis, D asymmetric) showing PTA vs. FAI labels, membership bar plots, and configuration vectors. Coloured background bands indicate WHO severity categories.</w:t>
       </w:r>
     </w:p>
     <w:p>

</xml_diff>